<commit_message>
Convert tables to bullets in OVERVIEW where prose reads better
Keep tables only for: end-to-end flow (sequential), xPlaytest/xCloud deliverables (SWAGs), and milestones (dates). Design decisions, contracts, and open risks are now bulleted lists -- 4 tables instead of 7.

Co-authored-by: Copilot <223556219+Copilot@users.noreply.github.com>
</commit_message>
<xml_diff>
--- a/Documentation/OVERVIEW.docx
+++ b/Documentation/OVERVIEW.docx
@@ -598,718 +598,414 @@
         <w:t xml:space="preserve">3. Design decisions</w:t>
       </w:r>
     </w:p>
-    <w:tbl>
-      <w:tblPr>
-        <w:tblStyle w:val="Table"/>
-        <w:tblW w:type="pct" w:w="5000"/>
-        <w:tblLayout w:type="fixed"/>
-        <w:tblLook w:firstRow="1" w:lastRow="0" w:firstColumn="0" w:lastColumn="0" w:noHBand="0" w:noVBand="0" w:val="0020"/>
-      </w:tblPr>
-      <w:tblGrid>
-        <w:gridCol w:w="2640"/>
-        <w:gridCol w:w="2640"/>
-        <w:gridCol w:w="2640"/>
-      </w:tblGrid>
-      <w:tr>
-        <w:trPr>
-          <w:tblHeader w:val="on"/>
-        </w:trPr>
-        <w:tc>
-          <w:tcPr/>
-          <w:p>
-            <w:pPr>
-              <w:pStyle w:val="CompactParagraph"/>
-            </w:pPr>
-            <w:r>
-              <w:t xml:space="preserve">#</w:t>
-            </w:r>
-          </w:p>
-        </w:tc>
-        <w:tc>
-          <w:tcPr/>
-          <w:p>
-            <w:pPr>
-              <w:pStyle w:val="CompactParagraph"/>
-            </w:pPr>
-            <w:r>
-              <w:t xml:space="preserve">Decision</w:t>
-            </w:r>
-          </w:p>
-        </w:tc>
-        <w:tc>
-          <w:tcPr/>
-          <w:p>
-            <w:pPr>
-              <w:pStyle w:val="CompactParagraph"/>
-            </w:pPr>
-            <w:r>
-              <w:t xml:space="preserve">Why</w:t>
-            </w:r>
-          </w:p>
-        </w:tc>
-      </w:tr>
-      <w:tr>
-        <w:tc>
-          <w:tcPr/>
-          <w:p>
-            <w:pPr>
-              <w:pStyle w:val="CompactParagraph"/>
-            </w:pPr>
-            <w:r>
-              <w:t xml:space="preserve">1</w:t>
-            </w:r>
-          </w:p>
-        </w:tc>
-        <w:tc>
-          <w:tcPr/>
-          <w:p>
-            <w:pPr>
-              <w:pStyle w:val="CompactParagraph"/>
-            </w:pPr>
-            <w:r>
-              <w:rPr>
-                <w:b/>
-                <w:bCs/>
-              </w:rPr>
-              <w:t xml:space="preserve">Streaming is opt-in, additive</w:t>
-            </w:r>
-            <w:r>
-              <w:t xml:space="preserve"> </w:t>
-            </w:r>
-            <w:r>
-              <w:t xml:space="preserve">to the download flow</w:t>
-            </w:r>
-          </w:p>
-        </w:tc>
-        <w:tc>
-          <w:tcPr/>
-          <w:p>
-            <w:pPr>
-              <w:pStyle w:val="CompactParagraph"/>
-            </w:pPr>
-            <w:r>
-              <w:t xml:space="preserve">Avoids surprising the existing creator base; keeps the new path low-risk.</w:t>
-            </w:r>
-          </w:p>
-        </w:tc>
-      </w:tr>
-      <w:tr>
-        <w:tc>
-          <w:tcPr/>
-          <w:p>
-            <w:pPr>
-              <w:pStyle w:val="CompactParagraph"/>
-            </w:pPr>
-            <w:r>
-              <w:t xml:space="preserve">2</w:t>
-            </w:r>
-          </w:p>
-        </w:tc>
-        <w:tc>
-          <w:tcPr/>
-          <w:p>
-            <w:pPr>
-              <w:pStyle w:val="CompactParagraph"/>
-            </w:pPr>
-            <w:r>
-              <w:rPr>
-                <w:b/>
-                <w:bCs/>
-              </w:rPr>
-              <w:t xml:space="preserve">One playtest = one title = one offering</w:t>
-            </w:r>
-          </w:p>
-        </w:tc>
-        <w:tc>
-          <w:tcPr/>
-          <w:p>
-            <w:pPr>
-              <w:pStyle w:val="CompactParagraph"/>
-            </w:pPr>
-            <w:r>
-              <w:t xml:space="preserve">Each playtest can target a distinct audience, so the auth boundary stays 1:1. Clustering is a v1.1 concern.</w:t>
-            </w:r>
-          </w:p>
-        </w:tc>
-      </w:tr>
-      <w:tr>
-        <w:tc>
-          <w:tcPr/>
-          <w:p>
-            <w:pPr>
-              <w:pStyle w:val="CompactParagraph"/>
-            </w:pPr>
-            <w:r>
-              <w:t xml:space="preserve">3</w:t>
-            </w:r>
-          </w:p>
-        </w:tc>
-        <w:tc>
-          <w:tcPr/>
-          <w:p>
-            <w:pPr>
-              <w:pStyle w:val="CompactParagraph"/>
-            </w:pPr>
-            <w:r>
-              <w:rPr>
-                <w:b/>
-                <w:bCs/>
-              </w:rPr>
-              <w:t xml:space="preserve">PC only in v1</w:t>
-            </w:r>
-            <w:r>
-              <w:t xml:space="preserve"> </w:t>
-            </w:r>
-            <w:r>
-              <w:t xml:space="preserve">(Xbox console deferred)</w:t>
-            </w:r>
-          </w:p>
-        </w:tc>
-        <w:tc>
-          <w:tcPr/>
-          <w:p>
-            <w:pPr>
-              <w:pStyle w:val="CompactParagraph"/>
-            </w:pPr>
-            <w:r>
-              <w:t xml:space="preserve">The existing publish path already targets</w:t>
-            </w:r>
-            <w:r>
-              <w:t xml:space="preserve"> </w:t>
-            </w:r>
-            <w:r>
-              <w:rPr>
-                <w:rStyle w:val="VerbatimChar"/>
-              </w:rPr>
-              <w:t xml:space="preserve">WINDOWS.DESKTOP</w:t>
-            </w:r>
-            <w:r>
-              <w:t xml:space="preserve">. Console adds Xbox-only allocator and title-id handling.</w:t>
-            </w:r>
-          </w:p>
-        </w:tc>
-      </w:tr>
-      <w:tr>
-        <w:tc>
-          <w:tcPr/>
-          <w:p>
-            <w:pPr>
-              <w:pStyle w:val="CompactParagraph"/>
-            </w:pPr>
-            <w:r>
-              <w:t xml:space="preserve">4</w:t>
-            </w:r>
-          </w:p>
-        </w:tc>
-        <w:tc>
-          <w:tcPr/>
-          <w:p>
-            <w:pPr>
-              <w:pStyle w:val="CompactParagraph"/>
-            </w:pPr>
-            <w:r>
-              <w:rPr>
-                <w:b/>
-                <w:bCs/>
-              </w:rPr>
-              <w:t xml:space="preserve">Auth gated at the offering level</w:t>
-            </w:r>
-            <w:r>
-              <w:t xml:space="preserve">, not per title</w:t>
-            </w:r>
-          </w:p>
-        </w:tc>
-        <w:tc>
-          <w:tcPr/>
-          <w:p>
-            <w:pPr>
-              <w:pStyle w:val="CompactParagraph"/>
-            </w:pPr>
-            <w:r>
-              <w:t xml:space="preserve">A single DNA-group check at offering entry; matches the pattern TestX already uses.</w:t>
-            </w:r>
-          </w:p>
-        </w:tc>
-      </w:tr>
-      <w:tr>
-        <w:tc>
-          <w:tcPr/>
-          <w:p>
-            <w:pPr>
-              <w:pStyle w:val="CompactParagraph"/>
-            </w:pPr>
-            <w:r>
-              <w:t xml:space="preserve">5</w:t>
-            </w:r>
-          </w:p>
-        </w:tc>
-        <w:tc>
-          <w:tcPr/>
-          <w:p>
-            <w:pPr>
-              <w:pStyle w:val="CompactParagraph"/>
-            </w:pPr>
-            <w:r>
-              <w:rPr>
-                <w:b/>
-                <w:bCs/>
-              </w:rPr>
-              <w:t xml:space="preserve">Bespoke</w:t>
-            </w:r>
-            <w:r>
-              <w:rPr>
-                <w:b/>
-                <w:bCs/>
-              </w:rPr>
-              <w:t xml:space="preserve"> </w:t>
-            </w:r>
-            <w:r>
-              <w:rPr>
-                <w:rStyle w:val="VerbatimChar"/>
-                <w:b/>
-                <w:bCs/>
-              </w:rPr>
-              <w:t xml:space="preserve">POST /playtest/ingestion</w:t>
-            </w:r>
-            <w:r>
-              <w:t xml:space="preserve">, not a generic</w:t>
-            </w:r>
-            <w:r>
-              <w:t xml:space="preserve"> </w:t>
-            </w:r>
-            <w:r>
-              <w:rPr>
-                <w:rStyle w:val="VerbatimChar"/>
-              </w:rPr>
-              <w:t xml:space="preserve">CreateOfferingFromStoreData</w:t>
-            </w:r>
-          </w:p>
-        </w:tc>
-        <w:tc>
-          <w:tcPr/>
-          <w:p>
-            <w:pPr>
-              <w:pStyle w:val="CompactParagraph"/>
-            </w:pPr>
-            <w:r>
-              <w:t xml:space="preserve">Keeps the contract small. Lets us encode playtest defaults (RETAIL sandbox, private audience) server-side. A generic surface is the future direction but out of summer scope.</w:t>
-            </w:r>
-          </w:p>
-        </w:tc>
-      </w:tr>
-      <w:tr>
-        <w:tc>
-          <w:tcPr/>
-          <w:p>
-            <w:pPr>
-              <w:pStyle w:val="CompactParagraph"/>
-            </w:pPr>
-            <w:r>
-              <w:t xml:space="preserve">6</w:t>
-            </w:r>
-          </w:p>
-        </w:tc>
-        <w:tc>
-          <w:tcPr/>
-          <w:p>
-            <w:pPr>
-              <w:pStyle w:val="CompactParagraph"/>
-            </w:pPr>
-            <w:r>
-              <w:rPr>
-                <w:b/>
-                <w:bCs/>
-              </w:rPr>
-              <w:t xml:space="preserve">Polling for terminal state</w:t>
-            </w:r>
-            <w:r>
-              <w:t xml:space="preserve">, not callbacks</w:t>
-            </w:r>
-          </w:p>
-        </w:tc>
-        <w:tc>
-          <w:tcPr/>
-          <w:p>
-            <w:pPr>
-              <w:pStyle w:val="CompactParagraph"/>
-            </w:pPr>
-            <w:r>
-              <w:t xml:space="preserve">SAGE is a request/response proxy today; cross-tenant callbacks need a message bus that does not yet exist. Polling reuses the publish workflow’s existing primitives.</w:t>
-            </w:r>
-          </w:p>
-        </w:tc>
-      </w:tr>
-      <w:tr>
-        <w:tc>
-          <w:tcPr/>
-          <w:p>
-            <w:pPr>
-              <w:pStyle w:val="CompactParagraph"/>
-            </w:pPr>
-            <w:r>
-              <w:t xml:space="preserve">7</w:t>
-            </w:r>
-          </w:p>
-        </w:tc>
-        <w:tc>
-          <w:tcPr/>
-          <w:p>
-            <w:pPr>
-              <w:pStyle w:val="CompactParagraph"/>
-            </w:pPr>
-            <w:r>
-              <w:rPr>
-                <w:b/>
-                <w:bCs/>
-              </w:rPr>
-              <w:t xml:space="preserve">Single flight id for install lookup</w:t>
-            </w:r>
-            <w:r>
-              <w:t xml:space="preserve"> </w:t>
-            </w:r>
-            <w:r>
-              <w:t xml:space="preserve">= lex-smallest DNA-group GUID</w:t>
-            </w:r>
-          </w:p>
-        </w:tc>
-        <w:tc>
-          <w:tcPr/>
-          <w:p>
-            <w:pPr>
-              <w:pStyle w:val="CompactParagraph"/>
-            </w:pPr>
-            <w:r>
-              <w:t xml:space="preserve">The install pipeline expects one flight id. All groups in a playtest point to the same build, so the choice is deterministic and re-run-stable. Audience check (XC5) still uses the full set.</w:t>
-            </w:r>
-          </w:p>
-        </w:tc>
-      </w:tr>
-      <w:tr>
-        <w:tc>
-          <w:tcPr/>
-          <w:p>
-            <w:pPr>
-              <w:pStyle w:val="CompactParagraph"/>
-            </w:pPr>
-            <w:r>
-              <w:t xml:space="preserve">8</w:t>
-            </w:r>
-          </w:p>
-        </w:tc>
-        <w:tc>
-          <w:tcPr/>
-          <w:p>
-            <w:pPr>
-              <w:pStyle w:val="CompactParagraph"/>
-            </w:pPr>
-            <w:r>
-              <w:rPr>
-                <w:b/>
-                <w:bCs/>
-              </w:rPr>
-              <w:t xml:space="preserve">Opaque offering id</w:t>
-            </w:r>
-            <w:r>
-              <w:t xml:space="preserve"> </w:t>
-            </w:r>
-            <w:r>
-              <w:t xml:space="preserve">(</w:t>
-            </w:r>
-            <w:r>
-              <w:rPr>
-                <w:rStyle w:val="VerbatimChar"/>
-              </w:rPr>
-              <w:t xml:space="preserve">xpt-{shortId}</w:t>
-            </w:r>
-            <w:r>
-              <w:t xml:space="preserve">); title id is name-derived for readability</w:t>
-            </w:r>
-          </w:p>
-        </w:tc>
-        <w:tc>
-          <w:tcPr/>
-          <w:p>
-            <w:pPr>
-              <w:pStyle w:val="CompactParagraph"/>
-            </w:pPr>
-            <w:r>
-              <w:t xml:space="preserve">Offering id has a 32-char cap and is auth-critical. Title id is more user-visible, so we strip the playtest name to alphanumeric and append the product id for uniqueness.</w:t>
-            </w:r>
-          </w:p>
-        </w:tc>
-      </w:tr>
-      <w:tr>
-        <w:tc>
-          <w:tcPr/>
-          <w:p>
-            <w:pPr>
-              <w:pStyle w:val="CompactParagraph"/>
-            </w:pPr>
-            <w:r>
-              <w:t xml:space="preserve">9</w:t>
-            </w:r>
-          </w:p>
-        </w:tc>
-        <w:tc>
-          <w:tcPr/>
-          <w:p>
-            <w:pPr>
-              <w:pStyle w:val="CompactParagraph"/>
-            </w:pPr>
-            <w:r>
-              <w:rPr>
-                <w:b/>
-                <w:bCs/>
-              </w:rPr>
-              <w:t xml:space="preserve">Short-term cross-tenant auth: Green → Corp</w:t>
-            </w:r>
-            <w:r>
-              <w:t xml:space="preserve"> </w:t>
-            </w:r>
-            <w:r>
-              <w:t xml:space="preserve">via SAGE</w:t>
-            </w:r>
-          </w:p>
-        </w:tc>
-        <w:tc>
-          <w:tcPr/>
-          <w:p>
-            <w:pPr>
-              <w:pStyle w:val="CompactParagraph"/>
-            </w:pPr>
-            <w:r>
-              <w:t xml:space="preserve">Rides an in-flight SAGE PR. The long-term PME story is owned by the GSS platform team and is out of scope.</w:t>
-            </w:r>
-          </w:p>
-        </w:tc>
-      </w:tr>
-      <w:tr>
-        <w:tc>
-          <w:tcPr/>
-          <w:p>
-            <w:pPr>
-              <w:pStyle w:val="CompactParagraph"/>
-            </w:pPr>
-            <w:r>
-              <w:t xml:space="preserve">10</w:t>
-            </w:r>
-          </w:p>
-        </w:tc>
-        <w:tc>
-          <w:tcPr/>
-          <w:p>
-            <w:pPr>
-              <w:pStyle w:val="CompactParagraph"/>
-            </w:pPr>
-            <w:r>
-              <w:rPr>
-                <w:b/>
-                <w:bCs/>
-              </w:rPr>
-              <w:t xml:space="preserve">Delete = tombstone + 7-day GC</w:t>
-            </w:r>
-            <w:r>
-              <w:t xml:space="preserve">, not synchronous hard delete</w:t>
-            </w:r>
-          </w:p>
-        </w:tc>
-        <w:tc>
-          <w:tcPr/>
-          <w:p>
-            <w:pPr>
-              <w:pStyle w:val="CompactParagraph"/>
-            </w:pPr>
-            <w:r>
-              <w:t xml:space="preserve">SFI requires manual PR approval for Partner Registry writes, so a true hard delete is not achievable in v1. Tombstoning clears</w:t>
-            </w:r>
-            <w:r>
-              <w:t xml:space="preserve"> </w:t>
-            </w:r>
-            <w:r>
-              <w:rPr>
-                <w:rStyle w:val="VerbatimChar"/>
-              </w:rPr>
-              <w:t xml:space="preserve">AllowedDnaGroups</w:t>
-            </w:r>
-            <w:r>
-              <w:t xml:space="preserve"> </w:t>
-            </w:r>
-            <w:r>
-              <w:t xml:space="preserve">immediately so testers lose access, and the offering disappears from the DevApi listing.</w:t>
-            </w:r>
-            <w:r>
-              <w:t xml:space="preserve"> </w:t>
-            </w:r>
-            <w:r>
-              <w:rPr>
-                <w:i/>
-                <w:iCs/>
-              </w:rPr>
-              <w:t xml:space="preserve">Needs explicit sign-off from xCloud reviewers.</w:t>
-            </w:r>
-          </w:p>
-        </w:tc>
-      </w:tr>
-      <w:tr>
-        <w:tc>
-          <w:tcPr/>
-          <w:p>
-            <w:pPr>
-              <w:pStyle w:val="CompactParagraph"/>
-            </w:pPr>
-            <w:r>
-              <w:t xml:space="preserve">11</w:t>
-            </w:r>
-          </w:p>
-        </w:tc>
-        <w:tc>
-          <w:tcPr/>
-          <w:p>
-            <w:pPr>
-              <w:pStyle w:val="CompactParagraph"/>
-            </w:pPr>
-            <w:r>
-              <w:rPr>
-                <w:b/>
-                <w:bCs/>
-              </w:rPr>
-              <w:t xml:space="preserve">Streaming-enabled playtests must carry an explicit expiration</w:t>
-            </w:r>
-          </w:p>
-        </w:tc>
-        <w:tc>
-          <w:tcPr/>
-          <w:p>
-            <w:pPr>
-              <w:pStyle w:val="CompactParagraph"/>
-            </w:pPr>
-            <w:r>
-              <w:t xml:space="preserve">xCloud needs a bounded end date. Download-only playtests are unaffected. UI default = 90 days; soft warning above 180.</w:t>
-            </w:r>
-          </w:p>
-        </w:tc>
-      </w:tr>
-      <w:tr>
-        <w:tc>
-          <w:tcPr/>
-          <w:p>
-            <w:pPr>
-              <w:pStyle w:val="CompactParagraph"/>
-            </w:pPr>
-            <w:r>
-              <w:t xml:space="preserve">12</w:t>
-            </w:r>
-          </w:p>
-        </w:tc>
-        <w:tc>
-          <w:tcPr/>
-          <w:p>
-            <w:pPr>
-              <w:pStyle w:val="CompactParagraph"/>
-            </w:pPr>
-            <w:r>
-              <w:rPr>
-                <w:b/>
-                <w:bCs/>
-              </w:rPr>
-              <w:t xml:space="preserve">Bundle offering write + title attach into a single PR</w:t>
-            </w:r>
-          </w:p>
-        </w:tc>
-        <w:tc>
-          <w:tcPr/>
-          <w:p>
-            <w:pPr>
-              <w:pStyle w:val="CompactParagraph"/>
-            </w:pPr>
-            <w:r>
-              <w:t xml:space="preserve">Cuts the manual SFI approval cost in half (1 PR per publish instead of 2).</w:t>
-            </w:r>
-          </w:p>
-        </w:tc>
-      </w:tr>
-      <w:tr>
-        <w:tc>
-          <w:tcPr/>
-          <w:p>
-            <w:pPr>
-              <w:pStyle w:val="CompactParagraph"/>
-            </w:pPr>
-            <w:r>
-              <w:t xml:space="preserve">13</w:t>
-            </w:r>
-          </w:p>
-        </w:tc>
-        <w:tc>
-          <w:tcPr/>
-          <w:p>
-            <w:pPr>
-              <w:pStyle w:val="CompactParagraph"/>
-            </w:pPr>
-            <w:r>
-              <w:rPr>
-                <w:b/>
-                <w:bCs/>
-              </w:rPr>
-              <w:t xml:space="preserve">External API unversioned today; internal</w:t>
-            </w:r>
-            <w:r>
-              <w:rPr>
-                <w:b/>
-                <w:bCs/>
-              </w:rPr>
-              <w:t xml:space="preserve"> </w:t>
-            </w:r>
-            <w:r>
-              <w:rPr>
-                <w:rStyle w:val="VerbatimChar"/>
-                <w:b/>
-                <w:bCs/>
-              </w:rPr>
-              <w:t xml:space="preserve">/v3/...</w:t>
-            </w:r>
-          </w:p>
-        </w:tc>
-        <w:tc>
-          <w:tcPr/>
-          <w:p>
-            <w:pPr>
-              <w:pStyle w:val="CompactParagraph"/>
-            </w:pPr>
-            <w:r>
-              <w:t xml:space="preserve">Matches existing SAGE and</w:t>
-            </w:r>
-            <w:r>
-              <w:t xml:space="preserve"> </w:t>
-            </w:r>
-            <w:r>
-              <w:rPr>
-                <w:rStyle w:val="VerbatimChar"/>
-              </w:rPr>
-              <w:t xml:space="preserve">WorkflowsControllerV3</w:t>
-            </w:r>
-            <w:r>
-              <w:t xml:space="preserve"> </w:t>
-            </w:r>
-            <w:r>
-              <w:t xml:space="preserve">conventions. Future breaking changes bump to</w:t>
-            </w:r>
-            <w:r>
-              <w:t xml:space="preserve"> </w:t>
-            </w:r>
-            <w:r>
-              <w:rPr>
-                <w:rStyle w:val="VerbatimChar"/>
-              </w:rPr>
-              <w:t xml:space="preserve">/v2/playtest/ingestion</w:t>
-            </w:r>
-            <w:r>
-              <w:t xml:space="preserve">. Additive optional fields do not require a bump.</w:t>
-            </w:r>
-          </w:p>
-        </w:tc>
-      </w:tr>
-    </w:tbl>
+    <w:p>
+      <w:pPr>
+        <w:pStyle w:val="CompactParagraph"/>
+        <w:numPr>
+          <w:ilvl w:val="0"/>
+          <w:numId w:val="1001"/>
+        </w:numPr>
+      </w:pPr>
+      <w:r>
+        <w:rPr>
+          <w:b/>
+          <w:bCs/>
+        </w:rPr>
+        <w:t xml:space="preserve">Streaming is opt-in, additive</w:t>
+      </w:r>
+      <w:r>
+        <w:t xml:space="preserve"> </w:t>
+      </w:r>
+      <w:r>
+        <w:t xml:space="preserve">to the download flow — keeps the existing creator path unaffected and the new path low-risk.</w:t>
+      </w:r>
+    </w:p>
+    <w:p>
+      <w:pPr>
+        <w:pStyle w:val="CompactParagraph"/>
+        <w:numPr>
+          <w:ilvl w:val="0"/>
+          <w:numId w:val="1001"/>
+        </w:numPr>
+      </w:pPr>
+      <w:r>
+        <w:rPr>
+          <w:b/>
+          <w:bCs/>
+        </w:rPr>
+        <w:t xml:space="preserve">One playtest = one title = one offering</w:t>
+      </w:r>
+      <w:r>
+        <w:t xml:space="preserve"> </w:t>
+      </w:r>
+      <w:r>
+        <w:t xml:space="preserve">in v1. Each playtest targets a distinct audience, so the auth boundary stays 1:1. Clustering is a v1.1 concern.</w:t>
+      </w:r>
+    </w:p>
+    <w:p>
+      <w:pPr>
+        <w:pStyle w:val="CompactParagraph"/>
+        <w:numPr>
+          <w:ilvl w:val="0"/>
+          <w:numId w:val="1001"/>
+        </w:numPr>
+      </w:pPr>
+      <w:r>
+        <w:rPr>
+          <w:b/>
+          <w:bCs/>
+        </w:rPr>
+        <w:t xml:space="preserve">PC only in v1.</w:t>
+      </w:r>
+      <w:r>
+        <w:t xml:space="preserve"> </w:t>
+      </w:r>
+      <w:r>
+        <w:t xml:space="preserve">The existing publish path already targets</w:t>
+      </w:r>
+      <w:r>
+        <w:t xml:space="preserve"> </w:t>
+      </w:r>
+      <w:r>
+        <w:rPr>
+          <w:rStyle w:val="VerbatimChar"/>
+        </w:rPr>
+        <w:t xml:space="preserve">WINDOWS.DESKTOP</w:t>
+      </w:r>
+      <w:r>
+        <w:t xml:space="preserve">; console support adds Xbox-only allocator and title-id handling and is deferred.</w:t>
+      </w:r>
+    </w:p>
+    <w:p>
+      <w:pPr>
+        <w:pStyle w:val="CompactParagraph"/>
+        <w:numPr>
+          <w:ilvl w:val="0"/>
+          <w:numId w:val="1001"/>
+        </w:numPr>
+      </w:pPr>
+      <w:r>
+        <w:rPr>
+          <w:b/>
+          <w:bCs/>
+        </w:rPr>
+        <w:t xml:space="preserve">Auth is gated at the offering level</w:t>
+      </w:r>
+      <w:r>
+        <w:t xml:space="preserve">, not per title — one DNA-group check at offering entry, matching the pattern TestX already uses.</w:t>
+      </w:r>
+    </w:p>
+    <w:p>
+      <w:pPr>
+        <w:pStyle w:val="CompactParagraph"/>
+        <w:numPr>
+          <w:ilvl w:val="0"/>
+          <w:numId w:val="1001"/>
+        </w:numPr>
+      </w:pPr>
+      <w:r>
+        <w:rPr>
+          <w:b/>
+          <w:bCs/>
+        </w:rPr>
+        <w:t xml:space="preserve">Bespoke</w:t>
+      </w:r>
+      <w:r>
+        <w:rPr>
+          <w:b/>
+          <w:bCs/>
+        </w:rPr>
+        <w:t xml:space="preserve"> </w:t>
+      </w:r>
+      <w:r>
+        <w:rPr>
+          <w:rStyle w:val="VerbatimChar"/>
+          <w:b/>
+          <w:bCs/>
+        </w:rPr>
+        <w:t xml:space="preserve">POST /playtest/ingestion</w:t>
+      </w:r>
+      <w:r>
+        <w:t xml:space="preserve"> </w:t>
+      </w:r>
+      <w:r>
+        <w:t xml:space="preserve">rather than a generic</w:t>
+      </w:r>
+      <w:r>
+        <w:t xml:space="preserve"> </w:t>
+      </w:r>
+      <w:r>
+        <w:rPr>
+          <w:rStyle w:val="VerbatimChar"/>
+        </w:rPr>
+        <w:t xml:space="preserve">CreateOfferingFromStoreData</w:t>
+      </w:r>
+      <w:r>
+        <w:t xml:space="preserve">. Keeps the contract small and lets us encode playtest defaults (RETAIL sandbox, private audience) server-side. A generic surface is the future direction but out of summer scope.</w:t>
+      </w:r>
+    </w:p>
+    <w:p>
+      <w:pPr>
+        <w:pStyle w:val="CompactParagraph"/>
+        <w:numPr>
+          <w:ilvl w:val="0"/>
+          <w:numId w:val="1001"/>
+        </w:numPr>
+      </w:pPr>
+      <w:r>
+        <w:rPr>
+          <w:b/>
+          <w:bCs/>
+        </w:rPr>
+        <w:t xml:space="preserve">Polling for terminal state</w:t>
+      </w:r>
+      <w:r>
+        <w:t xml:space="preserve">, not callbacks. SAGE is a request/response proxy today; cross-tenant callbacks need a message bus that does not yet exist. Polling reuses the publish workflow’s existing retry primitives.</w:t>
+      </w:r>
+    </w:p>
+    <w:p>
+      <w:pPr>
+        <w:pStyle w:val="CompactParagraph"/>
+        <w:numPr>
+          <w:ilvl w:val="0"/>
+          <w:numId w:val="1001"/>
+        </w:numPr>
+      </w:pPr>
+      <w:r>
+        <w:rPr>
+          <w:b/>
+          <w:bCs/>
+        </w:rPr>
+        <w:t xml:space="preserve">Install lookup uses a single flight id</w:t>
+      </w:r>
+      <w:r>
+        <w:t xml:space="preserve"> </w:t>
+      </w:r>
+      <w:r>
+        <w:t xml:space="preserve">— the lex-smallest DNA-group GUID. The install pipeline only accepts one, and all groups in a playtest point to the same build, so the choice is deterministic and re-run-stable. The audience check (XC5) still evaluates the full set.</w:t>
+      </w:r>
+    </w:p>
+    <w:p>
+      <w:pPr>
+        <w:pStyle w:val="CompactParagraph"/>
+        <w:numPr>
+          <w:ilvl w:val="0"/>
+          <w:numId w:val="1001"/>
+        </w:numPr>
+      </w:pPr>
+      <w:r>
+        <w:rPr>
+          <w:b/>
+          <w:bCs/>
+        </w:rPr>
+        <w:t xml:space="preserve">Offering id is opaque</w:t>
+      </w:r>
+      <w:r>
+        <w:t xml:space="preserve"> </w:t>
+      </w:r>
+      <w:r>
+        <w:t xml:space="preserve">(</w:t>
+      </w:r>
+      <w:r>
+        <w:rPr>
+          <w:rStyle w:val="VerbatimChar"/>
+        </w:rPr>
+        <w:t xml:space="preserve">xpt-{shortId}</w:t>
+      </w:r>
+      <w:r>
+        <w:t xml:space="preserve">) because it has a 32-char cap and is auth-critical.</w:t>
+      </w:r>
+      <w:r>
+        <w:t xml:space="preserve"> </w:t>
+      </w:r>
+      <w:r>
+        <w:rPr>
+          <w:b/>
+          <w:bCs/>
+        </w:rPr>
+        <w:t xml:space="preserve">Title id is name-derived</w:t>
+      </w:r>
+      <w:r>
+        <w:t xml:space="preserve"> </w:t>
+      </w:r>
+      <w:r>
+        <w:t xml:space="preserve">for readability — strip the playtest name to alphanumeric and append the product id for uniqueness.</w:t>
+      </w:r>
+    </w:p>
+    <w:p>
+      <w:pPr>
+        <w:pStyle w:val="CompactParagraph"/>
+        <w:numPr>
+          <w:ilvl w:val="0"/>
+          <w:numId w:val="1001"/>
+        </w:numPr>
+      </w:pPr>
+      <w:r>
+        <w:rPr>
+          <w:b/>
+          <w:bCs/>
+        </w:rPr>
+        <w:t xml:space="preserve">Short-term cross-tenant auth runs Green → Corp</w:t>
+      </w:r>
+      <w:r>
+        <w:t xml:space="preserve"> </w:t>
+      </w:r>
+      <w:r>
+        <w:t xml:space="preserve">via SAGE, riding an in-flight PR. The long-term PME story is owned by the GSS platform team and is out of scope.</w:t>
+      </w:r>
+    </w:p>
+    <w:p>
+      <w:pPr>
+        <w:pStyle w:val="CompactParagraph"/>
+        <w:numPr>
+          <w:ilvl w:val="0"/>
+          <w:numId w:val="1001"/>
+        </w:numPr>
+      </w:pPr>
+      <w:r>
+        <w:rPr>
+          <w:b/>
+          <w:bCs/>
+        </w:rPr>
+        <w:t xml:space="preserve">Delete is a tombstone + 7-day GC</w:t>
+      </w:r>
+      <w:r>
+        <w:t xml:space="preserve">, not a synchronous hard delete. SFI requires manual PR approval for Partner Registry writes, so a true hard delete is not achievable in v1. Tombstoning clears</w:t>
+      </w:r>
+      <w:r>
+        <w:t xml:space="preserve"> </w:t>
+      </w:r>
+      <w:r>
+        <w:rPr>
+          <w:rStyle w:val="VerbatimChar"/>
+        </w:rPr>
+        <w:t xml:space="preserve">AllowedDnaGroups</w:t>
+      </w:r>
+      <w:r>
+        <w:t xml:space="preserve"> </w:t>
+      </w:r>
+      <w:r>
+        <w:t xml:space="preserve">immediately so testers lose access, and the offering disappears from the DevApi listing.</w:t>
+      </w:r>
+      <w:r>
+        <w:t xml:space="preserve"> </w:t>
+      </w:r>
+      <w:r>
+        <w:rPr>
+          <w:i/>
+          <w:iCs/>
+        </w:rPr>
+        <w:t xml:space="preserve">Needs explicit sign-off from xCloud reviewers.</w:t>
+      </w:r>
+    </w:p>
+    <w:p>
+      <w:pPr>
+        <w:pStyle w:val="CompactParagraph"/>
+        <w:numPr>
+          <w:ilvl w:val="0"/>
+          <w:numId w:val="1001"/>
+        </w:numPr>
+      </w:pPr>
+      <w:r>
+        <w:rPr>
+          <w:b/>
+          <w:bCs/>
+        </w:rPr>
+        <w:t xml:space="preserve">Streaming-enabled playtests must carry an explicit expiration.</w:t>
+      </w:r>
+      <w:r>
+        <w:t xml:space="preserve"> </w:t>
+      </w:r>
+      <w:r>
+        <w:t xml:space="preserve">xCloud needs a bounded end date; download-only playtests are unaffected. UI default is 90 days with a soft warning above 180.</w:t>
+      </w:r>
+    </w:p>
+    <w:p>
+      <w:pPr>
+        <w:pStyle w:val="CompactParagraph"/>
+        <w:numPr>
+          <w:ilvl w:val="0"/>
+          <w:numId w:val="1001"/>
+        </w:numPr>
+      </w:pPr>
+      <w:r>
+        <w:rPr>
+          <w:b/>
+          <w:bCs/>
+        </w:rPr>
+        <w:t xml:space="preserve">Offering write + title attach are bundled into one PR</w:t>
+      </w:r>
+      <w:r>
+        <w:t xml:space="preserve"> </w:t>
+      </w:r>
+      <w:r>
+        <w:t xml:space="preserve">— cuts the manual SFI approval cost in half (one PR per publish instead of two).</w:t>
+      </w:r>
+    </w:p>
+    <w:p>
+      <w:pPr>
+        <w:pStyle w:val="CompactParagraph"/>
+        <w:numPr>
+          <w:ilvl w:val="0"/>
+          <w:numId w:val="1001"/>
+        </w:numPr>
+      </w:pPr>
+      <w:r>
+        <w:rPr>
+          <w:b/>
+          <w:bCs/>
+        </w:rPr>
+        <w:t xml:space="preserve">External API is unversioned today; internal routes live under</w:t>
+      </w:r>
+      <w:r>
+        <w:rPr>
+          <w:b/>
+          <w:bCs/>
+        </w:rPr>
+        <w:t xml:space="preserve"> </w:t>
+      </w:r>
+      <w:r>
+        <w:rPr>
+          <w:rStyle w:val="VerbatimChar"/>
+          <w:b/>
+          <w:bCs/>
+        </w:rPr>
+        <w:t xml:space="preserve">/v3/...</w:t>
+      </w:r>
+      <w:r>
+        <w:t xml:space="preserve"> </w:t>
+      </w:r>
+      <w:r>
+        <w:t xml:space="preserve">to match existing SAGE and</w:t>
+      </w:r>
+      <w:r>
+        <w:t xml:space="preserve"> </w:t>
+      </w:r>
+      <w:r>
+        <w:rPr>
+          <w:rStyle w:val="VerbatimChar"/>
+        </w:rPr>
+        <w:t xml:space="preserve">WorkflowsControllerV3</w:t>
+      </w:r>
+      <w:r>
+        <w:t xml:space="preserve"> </w:t>
+      </w:r>
+      <w:r>
+        <w:t xml:space="preserve">conventions. Future breaking changes bump to</w:t>
+      </w:r>
+      <w:r>
+        <w:t xml:space="preserve"> </w:t>
+      </w:r>
+      <w:r>
+        <w:rPr>
+          <w:rStyle w:val="VerbatimChar"/>
+        </w:rPr>
+        <w:t xml:space="preserve">/v2/playtest/ingestion</w:t>
+      </w:r>
+      <w:r>
+        <w:t xml:space="preserve">; additive optional fields do not require a bump.</w:t>
+      </w:r>
+    </w:p>
     <w:bookmarkEnd w:id="15"/>
     <w:bookmarkStart w:id="18" w:name="work-breakdown"/>
     <w:p>
@@ -2346,138 +2042,62 @@
         <w:t xml:space="preserve">5. Contracts</w:t>
       </w:r>
     </w:p>
-    <w:tbl>
-      <w:tblPr>
-        <w:tblStyle w:val="Table"/>
-        <w:tblW w:type="pct" w:w="5000"/>
-        <w:tblLayout w:type="fixed"/>
-        <w:tblLook w:firstRow="1" w:lastRow="0" w:firstColumn="0" w:lastColumn="0" w:noHBand="0" w:noVBand="0" w:val="0020"/>
-      </w:tblPr>
-      <w:tblGrid>
-        <w:gridCol w:w="3960"/>
-        <w:gridCol w:w="3960"/>
-      </w:tblGrid>
-      <w:tr>
-        <w:trPr>
-          <w:tblHeader w:val="on"/>
-        </w:trPr>
-        <w:tc>
-          <w:tcPr/>
-          <w:p>
-            <w:pPr>
-              <w:pStyle w:val="CompactParagraph"/>
-            </w:pPr>
-            <w:r>
-              <w:t xml:space="preserve">Surface</w:t>
-            </w:r>
-          </w:p>
-        </w:tc>
-        <w:tc>
-          <w:tcPr/>
-          <w:p>
-            <w:pPr>
-              <w:pStyle w:val="CompactParagraph"/>
-            </w:pPr>
-            <w:r>
-              <w:t xml:space="preserve">Where</w:t>
-            </w:r>
-          </w:p>
-        </w:tc>
-      </w:tr>
-      <w:tr>
-        <w:tc>
-          <w:tcPr/>
-          <w:p>
-            <w:pPr>
-              <w:pStyle w:val="CompactParagraph"/>
-            </w:pPr>
-            <w:r>
-              <w:t xml:space="preserve">External REST (xPlaytest ↔ SAGE)</w:t>
-            </w:r>
-          </w:p>
-        </w:tc>
-        <w:tc>
-          <w:tcPr/>
-          <w:p>
-            <w:pPr>
-              <w:pStyle w:val="CompactParagraph"/>
-            </w:pPr>
-            <w:hyperlink r:id="rId11">
-              <w:r>
-                <w:rPr>
-                  <w:rStyle w:val="VerbatimChar"/>
-                </w:rPr>
-                <w:t xml:space="preserve">openapi/playtest-ingestion.yaml</w:t>
-              </w:r>
-            </w:hyperlink>
-          </w:p>
-        </w:tc>
-      </w:tr>
-      <w:tr>
-        <w:tc>
-          <w:tcPr/>
-          <w:p>
-            <w:pPr>
-              <w:pStyle w:val="CompactParagraph"/>
-            </w:pPr>
-            <w:r>
-              <w:t xml:space="preserve">Internal contract types &amp; code references</w:t>
-            </w:r>
-          </w:p>
-        </w:tc>
-        <w:tc>
-          <w:tcPr/>
-          <w:p>
-            <w:pPr>
-              <w:pStyle w:val="CompactParagraph"/>
-            </w:pPr>
-            <w:hyperlink r:id="rId10">
-              <w:r>
-                <w:rPr>
-                  <w:rStyle w:val="VerbatimChar"/>
-                </w:rPr>
-                <w:t xml:space="preserve">ARCHITECTURE.md</w:t>
-              </w:r>
-            </w:hyperlink>
-          </w:p>
-        </w:tc>
-      </w:tr>
-      <w:tr>
-        <w:tc>
-          <w:tcPr/>
-          <w:p>
-            <w:pPr>
-              <w:pStyle w:val="CompactParagraph"/>
-            </w:pPr>
-            <w:r>
-              <w:t xml:space="preserve">Long-form spec (rationale, alternatives, code citations)</w:t>
-            </w:r>
-          </w:p>
-        </w:tc>
-        <w:tc>
-          <w:tcPr/>
-          <w:p>
-            <w:pPr>
-              <w:pStyle w:val="CompactParagraph"/>
-            </w:pPr>
-            <w:hyperlink r:id="rId9">
-              <w:r>
-                <w:rPr>
-                  <w:rStyle w:val="VerbatimChar"/>
-                </w:rPr>
-                <w:t xml:space="preserve">SPEC.md</w:t>
-              </w:r>
-            </w:hyperlink>
-          </w:p>
-        </w:tc>
-      </w:tr>
-    </w:tbl>
+    <w:p>
+      <w:pPr>
+        <w:pStyle w:val="FirstParagraph"/>
+      </w:pPr>
+      <w:r>
+        <w:t xml:space="preserve">The external REST contract lives in</w:t>
+      </w:r>
+      <w:r>
+        <w:t xml:space="preserve"> </w:t>
+      </w:r>
+      <w:hyperlink r:id="rId11">
+        <w:r>
+          <w:rPr>
+            <w:rStyle w:val="VerbatimChar"/>
+          </w:rPr>
+          <w:t xml:space="preserve">openapi/playtest-ingestion.yaml</w:t>
+        </w:r>
+      </w:hyperlink>
+      <w:r>
+        <w:t xml:space="preserve">. Internal contract types and code references live in</w:t>
+      </w:r>
+      <w:r>
+        <w:t xml:space="preserve"> </w:t>
+      </w:r>
+      <w:hyperlink r:id="rId10">
+        <w:r>
+          <w:rPr>
+            <w:rStyle w:val="VerbatimChar"/>
+          </w:rPr>
+          <w:t xml:space="preserve">ARCHITECTURE.md</w:t>
+        </w:r>
+      </w:hyperlink>
+      <w:r>
+        <w:t xml:space="preserve">. Full rationale, alternatives, and code citations live in</w:t>
+      </w:r>
+      <w:r>
+        <w:t xml:space="preserve"> </w:t>
+      </w:r>
+      <w:hyperlink r:id="rId9">
+        <w:r>
+          <w:rPr>
+            <w:rStyle w:val="VerbatimChar"/>
+          </w:rPr>
+          <w:t xml:space="preserve">SPEC.md</w:t>
+        </w:r>
+      </w:hyperlink>
+      <w:r>
+        <w:t xml:space="preserve">.</w:t>
+      </w:r>
+    </w:p>
     <w:p>
       <w:pPr>
         <w:pStyle w:val="BodyText"/>
       </w:pPr>
       <w:r>
-        <w:t xml:space="preserve">The single most important payload is</w:t>
+        <w:t xml:space="preserve">The central payload is</w:t>
       </w:r>
       <w:r>
         <w:t xml:space="preserve"> </w:t>
@@ -2489,7 +2109,7 @@
         <w:t xml:space="preserve">PlaytestIngestionJobParameters</w:t>
       </w:r>
       <w:r>
-        <w:t xml:space="preserve">. Required fields:</w:t>
+        <w:t xml:space="preserve">. Required fields are</w:t>
       </w:r>
       <w:r>
         <w:t xml:space="preserve"> </w:t>
@@ -2528,7 +2148,7 @@
         <w:t xml:space="preserve">ExpirationTime</w:t>
       </w:r>
       <w:r>
-        <w:t xml:space="preserve">,</w:t>
+        <w:t xml:space="preserve">, and</w:t>
       </w:r>
       <w:r>
         <w:t xml:space="preserve"> </w:t>
@@ -2540,7 +2160,7 @@
         <w:t xml:space="preserve">StoreAsset</w:t>
       </w:r>
       <w:r>
-        <w:t xml:space="preserve">. Optional with server defaults:</w:t>
+        <w:t xml:space="preserve">.</w:t>
       </w:r>
       <w:r>
         <w:t xml:space="preserve"> </w:t>
@@ -2555,7 +2175,7 @@
         <w:t xml:space="preserve"> </w:t>
       </w:r>
       <w:r>
-        <w:t xml:space="preserve">(→</w:t>
+        <w:t xml:space="preserve">and</w:t>
       </w:r>
       <w:r>
         <w:t xml:space="preserve"> </w:t>
@@ -2564,10 +2184,28 @@
         <w:rPr>
           <w:rStyle w:val="VerbatimChar"/>
         </w:rPr>
+        <w:t xml:space="preserve">IsGreenSigned</w:t>
+      </w:r>
+      <w:r>
+        <w:t xml:space="preserve"> </w:t>
+      </w:r>
+      <w:r>
+        <w:t xml:space="preserve">are optional and default server-side to</w:t>
+      </w:r>
+      <w:r>
+        <w:t xml:space="preserve"> </w:t>
+      </w:r>
+      <w:r>
+        <w:rPr>
+          <w:rStyle w:val="VerbatimChar"/>
+        </w:rPr>
         <w:t xml:space="preserve">RETAIL</w:t>
       </w:r>
       <w:r>
-        <w:t xml:space="preserve">),</w:t>
+        <w:t xml:space="preserve"> </w:t>
+      </w:r>
+      <w:r>
+        <w:t xml:space="preserve">and</w:t>
       </w:r>
       <w:r>
         <w:t xml:space="preserve"> </w:t>
@@ -2576,13 +2214,10 @@
         <w:rPr>
           <w:rStyle w:val="VerbatimChar"/>
         </w:rPr>
-        <w:t xml:space="preserve">IsGreenSigned</w:t>
-      </w:r>
-      <w:r>
-        <w:t xml:space="preserve"> </w:t>
-      </w:r>
-      <w:r>
-        <w:t xml:space="preserve">(→</w:t>
+        <w:t xml:space="preserve">true</w:t>
+      </w:r>
+      <w:r>
+        <w:t xml:space="preserve">.</w:t>
       </w:r>
       <w:r>
         <w:t xml:space="preserve"> </w:t>
@@ -2591,10 +2226,13 @@
         <w:rPr>
           <w:rStyle w:val="VerbatimChar"/>
         </w:rPr>
-        <w:t xml:space="preserve">true</w:t>
-      </w:r>
-      <w:r>
-        <w:t xml:space="preserve">). Reserved for future:</w:t>
+        <w:t xml:space="preserve">CallbackUrl</w:t>
+      </w:r>
+      <w:r>
+        <w:t xml:space="preserve"> </w:t>
+      </w:r>
+      <w:r>
+        <w:t xml:space="preserve">and</w:t>
       </w:r>
       <w:r>
         <w:t xml:space="preserve"> </w:t>
@@ -2603,22 +2241,13 @@
         <w:rPr>
           <w:rStyle w:val="VerbatimChar"/>
         </w:rPr>
-        <w:t xml:space="preserve">CallbackUrl</w:t>
-      </w:r>
-      <w:r>
-        <w:t xml:space="preserve">,</w:t>
-      </w:r>
-      <w:r>
-        <w:t xml:space="preserve"> </w:t>
-      </w:r>
-      <w:r>
-        <w:rPr>
-          <w:rStyle w:val="VerbatimChar"/>
-        </w:rPr>
         <w:t xml:space="preserve">CorrelationId</w:t>
       </w:r>
       <w:r>
-        <w:t xml:space="preserve">.</w:t>
+        <w:t xml:space="preserve"> </w:t>
+      </w:r>
+      <w:r>
+        <w:t xml:space="preserve">are reserved for future use.</w:t>
       </w:r>
     </w:p>
     <w:bookmarkEnd w:id="19"/>
@@ -3124,578 +2753,11 @@
         <w:pStyle w:val="CompactParagraph"/>
         <w:numPr>
           <w:ilvl w:val="0"/>
-          <w:numId w:val="1001"/>
+          <w:numId w:val="1002"/>
         </w:numPr>
       </w:pPr>
       <w:r>
         <w:t xml:space="preserve">Publishing a streaming-enabled playtest submits the xCloud ingestion within seconds and becomes live within one approver round-trip.</w:t>
-      </w:r>
-    </w:p>
-    <w:p>
-      <w:pPr>
-        <w:pStyle w:val="CompactParagraph"/>
-        <w:numPr>
-          <w:ilvl w:val="0"/>
-          <w:numId w:val="1001"/>
-        </w:numPr>
-      </w:pPr>
-      <w:r>
-        <w:t xml:space="preserve">The offering exists in Partner Registry with the audience’s DNA groups and a non-null expiration.</w:t>
-      </w:r>
-    </w:p>
-    <w:p>
-      <w:pPr>
-        <w:pStyle w:val="CompactParagraph"/>
-        <w:numPr>
-          <w:ilvl w:val="0"/>
-          <w:numId w:val="1001"/>
-        </w:numPr>
-      </w:pPr>
-      <w:r>
-        <w:t xml:space="preserve">The offering contains exactly one title corresponding to the playtest.</w:t>
-      </w:r>
-    </w:p>
-    <w:p>
-      <w:pPr>
-        <w:pStyle w:val="CompactParagraph"/>
-        <w:numPr>
-          <w:ilvl w:val="0"/>
-          <w:numId w:val="1001"/>
-        </w:numPr>
-      </w:pPr>
-      <w:r>
-        <w:t xml:space="preserve">An authorized tester can stream the playtest through xCloud via the launch URL.</w:t>
-      </w:r>
-    </w:p>
-    <w:p>
-      <w:pPr>
-        <w:pStyle w:val="CompactParagraph"/>
-        <w:numPr>
-          <w:ilvl w:val="0"/>
-          <w:numId w:val="1001"/>
-        </w:numPr>
-      </w:pPr>
-      <w:r>
-        <w:t xml:space="preserve">An unauthorized user opening the launch URL is denied with no metadata leakage.</w:t>
-      </w:r>
-    </w:p>
-    <w:p>
-      <w:pPr>
-        <w:pStyle w:val="CompactParagraph"/>
-        <w:numPr>
-          <w:ilvl w:val="0"/>
-          <w:numId w:val="1001"/>
-        </w:numPr>
-      </w:pPr>
-      <w:r>
-        <w:t xml:space="preserve">Audience, expiration, and build-republish changes after publish all re-propagate to xCloud.</w:t>
-      </w:r>
-    </w:p>
-    <w:p>
-      <w:pPr>
-        <w:pStyle w:val="CompactParagraph"/>
-        <w:numPr>
-          <w:ilvl w:val="0"/>
-          <w:numId w:val="1001"/>
-        </w:numPr>
-      </w:pPr>
-      <w:r>
-        <w:t xml:space="preserve">Deleting the playtest removes tester access within the GsToken refresh window and removes the offering from DevApi.</w:t>
-      </w:r>
-    </w:p>
-    <w:p>
-      <w:pPr>
-        <w:pStyle w:val="CompactParagraph"/>
-        <w:numPr>
-          <w:ilvl w:val="0"/>
-          <w:numId w:val="1001"/>
-        </w:numPr>
-      </w:pPr>
-      <w:r>
-        <w:t xml:space="preserve">Streaming-enabled publish is gated behind a seller / title allow-list feature flag during private preview.</w:t>
-      </w:r>
-    </w:p>
-    <w:p>
-      <w:pPr>
-        <w:pStyle w:val="CompactParagraph"/>
-        <w:numPr>
-          <w:ilvl w:val="0"/>
-          <w:numId w:val="1001"/>
-        </w:numPr>
-      </w:pPr>
-      <w:r>
-        <w:t xml:space="preserve">xCloud ingestion failure does</w:t>
-      </w:r>
-      <w:r>
-        <w:t xml:space="preserve"> </w:t>
-      </w:r>
-      <w:r>
-        <w:rPr>
-          <w:b/>
-          <w:bCs/>
-        </w:rPr>
-        <w:t xml:space="preserve">not</w:t>
-      </w:r>
-      <w:r>
-        <w:t xml:space="preserve"> </w:t>
-      </w:r>
-      <w:r>
-        <w:t xml:space="preserve">block the download playtest from publishing.</w:t>
-      </w:r>
-    </w:p>
-    <w:p>
-      <w:pPr>
-        <w:pStyle w:val="FirstParagraph"/>
-      </w:pPr>
-      <w:r>
-        <w:rPr>
-          <w:b/>
-          <w:bCs/>
-        </w:rPr>
-        <w:t xml:space="preserve">P1 (deferred):</w:t>
-      </w:r>
-      <w:r>
-        <w:t xml:space="preserve"> </w:t>
-      </w:r>
-      <w:r>
-        <w:t xml:space="preserve">Bayside login flow on the launch URL; GSSV</w:t>
-      </w:r>
-      <w:r>
-        <w:t xml:space="preserve"> </w:t>
-      </w:r>
-      <w:r>
-        <w:rPr>
-          <w:rStyle w:val="VerbatimChar"/>
-        </w:rPr>
-        <w:t xml:space="preserve">/offerings</w:t>
-      </w:r>
-      <w:r>
-        <w:t xml:space="preserve"> </w:t>
-      </w:r>
-      <w:r>
-        <w:t xml:space="preserve">returns the user’s accessible playtest offerings for in-client discovery.</w:t>
-      </w:r>
-      <w:r>
-        <w:t xml:space="preserve"> </w:t>
-      </w:r>
-      <w:r>
-        <w:rPr>
-          <w:b/>
-          <w:bCs/>
-        </w:rPr>
-        <w:t xml:space="preserve">P3 (out of scope):</w:t>
-      </w:r>
-      <w:r>
-        <w:t xml:space="preserve"> </w:t>
-      </w:r>
-      <w:r>
-        <w:t xml:space="preserve">Xbox console support, region / touch-control configuration, in-stream feedback collection.</w:t>
-      </w:r>
-    </w:p>
-    <w:bookmarkEnd w:id="21"/>
-    <w:bookmarkStart w:id="22" w:name="known-risks-and-open-items"/>
-    <w:p>
-      <w:pPr>
-        <w:pStyle w:val="Heading2"/>
-      </w:pPr>
-      <w:r>
-        <w:t xml:space="preserve">8. Known risks and open items</w:t>
-      </w:r>
-    </w:p>
-    <w:tbl>
-      <w:tblPr>
-        <w:tblStyle w:val="Table"/>
-        <w:tblW w:type="pct" w:w="5000"/>
-        <w:tblLayout w:type="fixed"/>
-        <w:tblLook w:firstRow="1" w:lastRow="0" w:firstColumn="0" w:lastColumn="0" w:noHBand="0" w:noVBand="0" w:val="0020"/>
-      </w:tblPr>
-      <w:tblGrid>
-        <w:gridCol w:w="2640"/>
-        <w:gridCol w:w="2640"/>
-        <w:gridCol w:w="2640"/>
-      </w:tblGrid>
-      <w:tr>
-        <w:trPr>
-          <w:tblHeader w:val="on"/>
-        </w:trPr>
-        <w:tc>
-          <w:tcPr/>
-          <w:p>
-            <w:pPr>
-              <w:pStyle w:val="CompactParagraph"/>
-            </w:pPr>
-            <w:r>
-              <w:t xml:space="preserve">Item</w:t>
-            </w:r>
-          </w:p>
-        </w:tc>
-        <w:tc>
-          <w:tcPr/>
-          <w:p>
-            <w:pPr>
-              <w:pStyle w:val="CompactParagraph"/>
-            </w:pPr>
-            <w:r>
-              <w:t xml:space="preserve">Status</w:t>
-            </w:r>
-          </w:p>
-        </w:tc>
-        <w:tc>
-          <w:tcPr/>
-          <w:p>
-            <w:pPr>
-              <w:pStyle w:val="CompactParagraph"/>
-            </w:pPr>
-            <w:r>
-              <w:t xml:space="preserve">Plan</w:t>
-            </w:r>
-          </w:p>
-        </w:tc>
-      </w:tr>
-      <w:tr>
-        <w:tc>
-          <w:tcPr/>
-          <w:p>
-            <w:pPr>
-              <w:pStyle w:val="CompactParagraph"/>
-            </w:pPr>
-            <w:r>
-              <w:t xml:space="preserve">Cross-tenant S2S long-term (PME)</w:t>
-            </w:r>
-          </w:p>
-        </w:tc>
-        <w:tc>
-          <w:tcPr/>
-          <w:p>
-            <w:pPr>
-              <w:pStyle w:val="CompactParagraph"/>
-            </w:pPr>
-            <w:r>
-              <w:t xml:space="preserve">Open</w:t>
-            </w:r>
-          </w:p>
-        </w:tc>
-        <w:tc>
-          <w:tcPr/>
-          <w:p>
-            <w:pPr>
-              <w:pStyle w:val="CompactParagraph"/>
-            </w:pPr>
-            <w:r>
-              <w:t xml:space="preserve">GSS platform team owns the PME story. xPlaytest rides the short-term Green → Corp PR; the call site is marked for revisit.</w:t>
-            </w:r>
-          </w:p>
-        </w:tc>
-      </w:tr>
-      <w:tr>
-        <w:tc>
-          <w:tcPr/>
-          <w:p>
-            <w:pPr>
-              <w:pStyle w:val="CompactParagraph"/>
-            </w:pPr>
-            <w:r>
-              <w:t xml:space="preserve">Manual PR approval on Partner Registry writes</w:t>
-            </w:r>
-          </w:p>
-        </w:tc>
-        <w:tc>
-          <w:tcPr/>
-          <w:p>
-            <w:pPr>
-              <w:pStyle w:val="CompactParagraph"/>
-            </w:pPr>
-            <w:r>
-              <w:t xml:space="preserve">Mitigated</w:t>
-            </w:r>
-          </w:p>
-        </w:tc>
-        <w:tc>
-          <w:tcPr/>
-          <w:p>
-            <w:pPr>
-              <w:pStyle w:val="CompactParagraph"/>
-            </w:pPr>
-            <w:r>
-              <w:t xml:space="preserve">One bundled PR per publish instead of two; xCloud reviewers approve out-of-band for the internship.</w:t>
-            </w:r>
-          </w:p>
-        </w:tc>
-      </w:tr>
-      <w:tr>
-        <w:tc>
-          <w:tcPr/>
-          <w:p>
-            <w:pPr>
-              <w:pStyle w:val="CompactParagraph"/>
-            </w:pPr>
-            <w:r>
-              <w:rPr>
-                <w:rStyle w:val="VerbatimChar"/>
-              </w:rPr>
-              <w:t xml:space="preserve">XboxTitleId</w:t>
-            </w:r>
-            <w:r>
-              <w:t xml:space="preserve"> </w:t>
-            </w:r>
-            <w:r>
-              <w:t xml:space="preserve">resolver</w:t>
-            </w:r>
-          </w:p>
-        </w:tc>
-        <w:tc>
-          <w:tcPr/>
-          <w:p>
-            <w:pPr>
-              <w:pStyle w:val="CompactParagraph"/>
-            </w:pPr>
-            <w:r>
-              <w:t xml:space="preserve">Open (P0 in PT2)</w:t>
-            </w:r>
-          </w:p>
-        </w:tc>
-        <w:tc>
-          <w:tcPr/>
-          <w:p>
-            <w:pPr>
-              <w:pStyle w:val="CompactParagraph"/>
-            </w:pPr>
-            <w:r>
-              <w:t xml:space="preserve">Read</w:t>
-            </w:r>
-            <w:r>
-              <w:t xml:space="preserve"> </w:t>
-            </w:r>
-            <w:r>
-              <w:rPr>
-                <w:rStyle w:val="VerbatimChar"/>
-              </w:rPr>
-              <w:t xml:space="preserve">alternateIds[XboxTitleId]</w:t>
-            </w:r>
-            <w:r>
-              <w:t xml:space="preserve"> </w:t>
-            </w:r>
-            <w:r>
-              <w:t xml:space="preserve">from XProduct; replaces today’s empty hardcode.</w:t>
-            </w:r>
-          </w:p>
-        </w:tc>
-      </w:tr>
-      <w:tr>
-        <w:tc>
-          <w:tcPr/>
-          <w:p>
-            <w:pPr>
-              <w:pStyle w:val="CompactParagraph"/>
-            </w:pPr>
-            <w:r>
-              <w:rPr>
-                <w:rStyle w:val="VerbatimChar"/>
-              </w:rPr>
-              <w:t xml:space="preserve">AumID</w:t>
-            </w:r>
-            <w:r>
-              <w:t xml:space="preserve"> </w:t>
-            </w:r>
-            <w:r>
-              <w:t xml:space="preserve">for PC</w:t>
-            </w:r>
-          </w:p>
-        </w:tc>
-        <w:tc>
-          <w:tcPr/>
-          <w:p>
-            <w:pPr>
-              <w:pStyle w:val="CompactParagraph"/>
-            </w:pPr>
-            <w:r>
-              <w:t xml:space="preserve">Decided</w:t>
-            </w:r>
-          </w:p>
-        </w:tc>
-        <w:tc>
-          <w:tcPr/>
-          <w:p>
-            <w:pPr>
-              <w:pStyle w:val="CompactParagraph"/>
-            </w:pPr>
-            <w:r>
-              <w:t xml:space="preserve">Ship a constant default for v1 (telemetry-only on server side); v1.1 plumbs the real</w:t>
-            </w:r>
-            <w:r>
-              <w:t xml:space="preserve"> </w:t>
-            </w:r>
-            <w:r>
-              <w:rPr>
-                <w:rStyle w:val="VerbatimChar"/>
-              </w:rPr>
-              <w:t xml:space="preserve">ApplicationId</w:t>
-            </w:r>
-            <w:r>
-              <w:t xml:space="preserve"> </w:t>
-            </w:r>
-            <w:r>
-              <w:t xml:space="preserve">from the AppX manifest.</w:t>
-            </w:r>
-          </w:p>
-        </w:tc>
-      </w:tr>
-      <w:tr>
-        <w:tc>
-          <w:tcPr/>
-          <w:p>
-            <w:pPr>
-              <w:pStyle w:val="CompactParagraph"/>
-            </w:pPr>
-            <w:r>
-              <w:t xml:space="preserve">PC install poll path</w:t>
-            </w:r>
-          </w:p>
-        </w:tc>
-        <w:tc>
-          <w:tcPr/>
-          <w:p>
-            <w:pPr>
-              <w:pStyle w:val="CompactParagraph"/>
-            </w:pPr>
-            <w:r>
-              <w:t xml:space="preserve">Open (audit in XC6)</w:t>
-            </w:r>
-          </w:p>
-        </w:tc>
-        <w:tc>
-          <w:tcPr/>
-          <w:p>
-            <w:pPr>
-              <w:pStyle w:val="CompactParagraph"/>
-            </w:pPr>
-            <w:r>
-              <w:t xml:space="preserve">Today’s allocator parameters are Xbox-only. XC6 audits and branches</w:t>
-            </w:r>
-            <w:r>
-              <w:t xml:space="preserve"> </w:t>
-            </w:r>
-            <w:r>
-              <w:rPr>
-                <w:rStyle w:val="VerbatimChar"/>
-              </w:rPr>
-              <w:t xml:space="preserve">ServerFilter</w:t>
-            </w:r>
-            <w:r>
-              <w:t xml:space="preserve"> </w:t>
-            </w:r>
-            <w:r>
-              <w:t xml:space="preserve">on</w:t>
-            </w:r>
-            <w:r>
-              <w:t xml:space="preserve"> </w:t>
-            </w:r>
-            <w:r>
-              <w:rPr>
-                <w:rStyle w:val="VerbatimChar"/>
-              </w:rPr>
-              <w:t xml:space="preserve">Platform</w:t>
-            </w:r>
-            <w:r>
-              <w:t xml:space="preserve">.</w:t>
-            </w:r>
-          </w:p>
-        </w:tc>
-      </w:tr>
-      <w:tr>
-        <w:tc>
-          <w:tcPr/>
-          <w:p>
-            <w:pPr>
-              <w:pStyle w:val="CompactParagraph"/>
-            </w:pPr>
-            <w:r>
-              <w:t xml:space="preserve">Stable playtest identity for offering id</w:t>
-            </w:r>
-          </w:p>
-        </w:tc>
-        <w:tc>
-          <w:tcPr/>
-          <w:p>
-            <w:pPr>
-              <w:pStyle w:val="CompactParagraph"/>
-            </w:pPr>
-            <w:r>
-              <w:t xml:space="preserve">Open</w:t>
-            </w:r>
-          </w:p>
-        </w:tc>
-        <w:tc>
-          <w:tcPr/>
-          <w:p>
-            <w:pPr>
-              <w:pStyle w:val="CompactParagraph"/>
-            </w:pPr>
-            <w:r>
-              <w:t xml:space="preserve">xPlaytest confirms whether</w:t>
-            </w:r>
-            <w:r>
-              <w:t xml:space="preserve"> </w:t>
-            </w:r>
-            <w:r>
-              <w:rPr>
-                <w:rStyle w:val="VerbatimChar"/>
-              </w:rPr>
-              <w:t xml:space="preserve">PartnerCenterProductId</w:t>
-            </w:r>
-            <w:r>
-              <w:t xml:space="preserve"> </w:t>
-            </w:r>
-            <w:r>
-              <w:t xml:space="preserve">is stable across republishes (recommended); otherwise we use the equivalent stable upstream id. Materially changes the offering-proliferation story on nightly republishes.</w:t>
-            </w:r>
-          </w:p>
-        </w:tc>
-      </w:tr>
-      <w:tr>
-        <w:tc>
-          <w:tcPr/>
-          <w:p>
-            <w:pPr>
-              <w:pStyle w:val="CompactParagraph"/>
-            </w:pPr>
-            <w:r>
-              <w:t xml:space="preserve">Delete model (tombstone vs hard delete)</w:t>
-            </w:r>
-          </w:p>
-        </w:tc>
-        <w:tc>
-          <w:tcPr/>
-          <w:p>
-            <w:pPr>
-              <w:pStyle w:val="CompactParagraph"/>
-            </w:pPr>
-            <w:r>
-              <w:t xml:space="preserve">Decision pending sign-off</w:t>
-            </w:r>
-          </w:p>
-        </w:tc>
-        <w:tc>
-          <w:tcPr/>
-          <w:p>
-            <w:pPr>
-              <w:pStyle w:val="CompactParagraph"/>
-            </w:pPr>
-            <w:r>
-              <w:t xml:space="preserve">v1 ships tombstone + 7d GC. User-visible behavior matches the P0 wording. Needs explicit xCloud sign-off.</w:t>
-            </w:r>
-          </w:p>
-        </w:tc>
-      </w:tr>
-    </w:tbl>
-    <w:bookmarkEnd w:id="22"/>
-    <w:bookmarkStart w:id="23" w:name="glossary"/>
-    <w:p>
-      <w:pPr>
-        <w:pStyle w:val="Heading2"/>
-      </w:pPr>
-      <w:r>
-        <w:t xml:space="preserve">Glossary</w:t>
       </w:r>
     </w:p>
     <w:p>
@@ -3707,29 +2769,7 @@
         </w:numPr>
       </w:pPr>
       <w:r>
-        <w:rPr>
-          <w:b/>
-          <w:bCs/>
-        </w:rPr>
-        <w:t xml:space="preserve">DNA group</w:t>
-      </w:r>
-      <w:r>
-        <w:t xml:space="preserve"> </w:t>
-      </w:r>
-      <w:r>
-        <w:t xml:space="preserve">— GMS audience grouping; resolves to the GUIDs in</w:t>
-      </w:r>
-      <w:r>
-        <w:t xml:space="preserve"> </w:t>
-      </w:r>
-      <w:r>
-        <w:rPr>
-          <w:rStyle w:val="VerbatimChar"/>
-        </w:rPr>
-        <w:t xml:space="preserve">AllowedDnaGroups</w:t>
-      </w:r>
-      <w:r>
-        <w:t xml:space="preserve">.</w:t>
+        <w:t xml:space="preserve">The offering exists in Partner Registry with the audience’s DNA groups and a non-null expiration.</w:t>
       </w:r>
     </w:p>
     <w:p>
@@ -3741,17 +2781,7 @@
         </w:numPr>
       </w:pPr>
       <w:r>
-        <w:rPr>
-          <w:b/>
-          <w:bCs/>
-        </w:rPr>
-        <w:t xml:space="preserve">GMS</w:t>
-      </w:r>
-      <w:r>
-        <w:t xml:space="preserve"> </w:t>
-      </w:r>
-      <w:r>
-        <w:t xml:space="preserve">— Group Management Service.</w:t>
+        <w:t xml:space="preserve">The offering contains exactly one title corresponding to the playtest.</w:t>
       </w:r>
     </w:p>
     <w:p>
@@ -3763,32 +2793,7 @@
         </w:numPr>
       </w:pPr>
       <w:r>
-        <w:rPr>
-          <w:b/>
-          <w:bCs/>
-        </w:rPr>
-        <w:t xml:space="preserve">GsToken</w:t>
-      </w:r>
-      <w:r>
-        <w:t xml:space="preserve"> </w:t>
-      </w:r>
-      <w:r>
-        <w:t xml:space="preserve">— Game Streaming token; carries</w:t>
-      </w:r>
-      <w:r>
-        <w:t xml:space="preserve"> </w:t>
-      </w:r>
-      <w:r>
-        <w:rPr>
-          <w:rStyle w:val="VerbatimChar"/>
-        </w:rPr>
-        <w:t xml:space="preserve">DnaGroups</w:t>
-      </w:r>
-      <w:r>
-        <w:t xml:space="preserve"> </w:t>
-      </w:r>
-      <w:r>
-        <w:t xml:space="preserve">claims.</w:t>
+        <w:t xml:space="preserve">An authorized tester can stream the playtest through xCloud via the launch URL.</w:t>
       </w:r>
     </w:p>
     <w:p>
@@ -3800,17 +2805,7 @@
         </w:numPr>
       </w:pPr>
       <w:r>
-        <w:rPr>
-          <w:b/>
-          <w:bCs/>
-        </w:rPr>
-        <w:t xml:space="preserve">SAGE</w:t>
-      </w:r>
-      <w:r>
-        <w:t xml:space="preserve"> </w:t>
-      </w:r>
-      <w:r>
-        <w:t xml:space="preserve">— Service API Gateway; cross-tenant ingress proxy for xCloud.</w:t>
+        <w:t xml:space="preserve">An unauthorized user opening the launch URL is denied with no metadata leakage.</w:t>
       </w:r>
     </w:p>
     <w:p>
@@ -3822,17 +2817,7 @@
         </w:numPr>
       </w:pPr>
       <w:r>
-        <w:rPr>
-          <w:b/>
-          <w:bCs/>
-        </w:rPr>
-        <w:t xml:space="preserve">SUCU</w:t>
-      </w:r>
-      <w:r>
-        <w:t xml:space="preserve"> </w:t>
-      </w:r>
-      <w:r>
-        <w:t xml:space="preserve">— Streaming Update Catalog; xCloud’s package-version resolution.</w:t>
+        <w:t xml:space="preserve">Audience, expiration, and build-republish changes after publish all re-propagate to xCloud.</w:t>
       </w:r>
     </w:p>
     <w:p>
@@ -3844,17 +2829,7 @@
         </w:numPr>
       </w:pPr>
       <w:r>
-        <w:rPr>
-          <w:b/>
-          <w:bCs/>
-        </w:rPr>
-        <w:t xml:space="preserve">SFI</w:t>
-      </w:r>
-      <w:r>
-        <w:t xml:space="preserve"> </w:t>
-      </w:r>
-      <w:r>
-        <w:t xml:space="preserve">— Secure Future Initiative; the policy regime that forbids self-approving PRs.</w:t>
+        <w:t xml:space="preserve">Deleting the playtest removes tester access within the GsToken refresh window and removes the offering from DevApi.</w:t>
       </w:r>
     </w:p>
     <w:p>
@@ -3863,6 +2838,600 @@
         <w:numPr>
           <w:ilvl w:val="0"/>
           <w:numId w:val="1002"/>
+        </w:numPr>
+      </w:pPr>
+      <w:r>
+        <w:t xml:space="preserve">Streaming-enabled publish is gated behind a seller / title allow-list feature flag during private preview.</w:t>
+      </w:r>
+    </w:p>
+    <w:p>
+      <w:pPr>
+        <w:pStyle w:val="CompactParagraph"/>
+        <w:numPr>
+          <w:ilvl w:val="0"/>
+          <w:numId w:val="1002"/>
+        </w:numPr>
+      </w:pPr>
+      <w:r>
+        <w:t xml:space="preserve">xCloud ingestion failure does</w:t>
+      </w:r>
+      <w:r>
+        <w:t xml:space="preserve"> </w:t>
+      </w:r>
+      <w:r>
+        <w:rPr>
+          <w:b/>
+          <w:bCs/>
+        </w:rPr>
+        <w:t xml:space="preserve">not</w:t>
+      </w:r>
+      <w:r>
+        <w:t xml:space="preserve"> </w:t>
+      </w:r>
+      <w:r>
+        <w:t xml:space="preserve">block the download playtest from publishing.</w:t>
+      </w:r>
+    </w:p>
+    <w:p>
+      <w:pPr>
+        <w:pStyle w:val="FirstParagraph"/>
+      </w:pPr>
+      <w:r>
+        <w:rPr>
+          <w:b/>
+          <w:bCs/>
+        </w:rPr>
+        <w:t xml:space="preserve">P1 (deferred):</w:t>
+      </w:r>
+      <w:r>
+        <w:t xml:space="preserve"> </w:t>
+      </w:r>
+      <w:r>
+        <w:t xml:space="preserve">Bayside login flow on the launch URL; GSSV</w:t>
+      </w:r>
+      <w:r>
+        <w:t xml:space="preserve"> </w:t>
+      </w:r>
+      <w:r>
+        <w:rPr>
+          <w:rStyle w:val="VerbatimChar"/>
+        </w:rPr>
+        <w:t xml:space="preserve">/offerings</w:t>
+      </w:r>
+      <w:r>
+        <w:t xml:space="preserve"> </w:t>
+      </w:r>
+      <w:r>
+        <w:t xml:space="preserve">returns the user’s accessible playtest offerings for in-client discovery.</w:t>
+      </w:r>
+      <w:r>
+        <w:t xml:space="preserve"> </w:t>
+      </w:r>
+      <w:r>
+        <w:rPr>
+          <w:b/>
+          <w:bCs/>
+        </w:rPr>
+        <w:t xml:space="preserve">P3 (out of scope):</w:t>
+      </w:r>
+      <w:r>
+        <w:t xml:space="preserve"> </w:t>
+      </w:r>
+      <w:r>
+        <w:t xml:space="preserve">Xbox console support, region / touch-control configuration, in-stream feedback collection.</w:t>
+      </w:r>
+    </w:p>
+    <w:bookmarkEnd w:id="21"/>
+    <w:bookmarkStart w:id="22" w:name="known-risks-and-open-items"/>
+    <w:p>
+      <w:pPr>
+        <w:pStyle w:val="Heading2"/>
+      </w:pPr>
+      <w:r>
+        <w:t xml:space="preserve">8. Known risks and open items</w:t>
+      </w:r>
+    </w:p>
+    <w:p>
+      <w:pPr>
+        <w:pStyle w:val="CompactParagraph"/>
+        <w:numPr>
+          <w:ilvl w:val="0"/>
+          <w:numId w:val="1003"/>
+        </w:numPr>
+      </w:pPr>
+      <w:r>
+        <w:rPr>
+          <w:b/>
+          <w:bCs/>
+        </w:rPr>
+        <w:t xml:space="preserve">Cross-tenant S2S long-term (PME).</w:t>
+      </w:r>
+      <w:r>
+        <w:t xml:space="preserve"> </w:t>
+      </w:r>
+      <w:r>
+        <w:rPr>
+          <w:i/>
+          <w:iCs/>
+        </w:rPr>
+        <w:t xml:space="preserve">Open.</w:t>
+      </w:r>
+      <w:r>
+        <w:t xml:space="preserve"> </w:t>
+      </w:r>
+      <w:r>
+        <w:t xml:space="preserve">The GSS platform team owns the PME story. xPlaytest rides the short-term Green → Corp PR; the call site is marked for revisit.</w:t>
+      </w:r>
+    </w:p>
+    <w:p>
+      <w:pPr>
+        <w:pStyle w:val="CompactParagraph"/>
+        <w:numPr>
+          <w:ilvl w:val="0"/>
+          <w:numId w:val="1003"/>
+        </w:numPr>
+      </w:pPr>
+      <w:r>
+        <w:rPr>
+          <w:b/>
+          <w:bCs/>
+        </w:rPr>
+        <w:t xml:space="preserve">Manual PR approval on Partner Registry writes.</w:t>
+      </w:r>
+      <w:r>
+        <w:t xml:space="preserve"> </w:t>
+      </w:r>
+      <w:r>
+        <w:rPr>
+          <w:i/>
+          <w:iCs/>
+        </w:rPr>
+        <w:t xml:space="preserve">Mitigated.</w:t>
+      </w:r>
+      <w:r>
+        <w:t xml:space="preserve"> </w:t>
+      </w:r>
+      <w:r>
+        <w:t xml:space="preserve">One bundled PR per publish instead of two; xCloud reviewers approve out-of-band for the duration of the internship.</w:t>
+      </w:r>
+    </w:p>
+    <w:p>
+      <w:pPr>
+        <w:pStyle w:val="CompactParagraph"/>
+        <w:numPr>
+          <w:ilvl w:val="0"/>
+          <w:numId w:val="1003"/>
+        </w:numPr>
+      </w:pPr>
+      <w:r>
+        <w:rPr>
+          <w:rStyle w:val="VerbatimChar"/>
+          <w:b/>
+          <w:bCs/>
+        </w:rPr>
+        <w:t xml:space="preserve">XboxTitleId</w:t>
+      </w:r>
+      <w:r>
+        <w:rPr>
+          <w:b/>
+          <w:bCs/>
+        </w:rPr>
+        <w:t xml:space="preserve"> </w:t>
+      </w:r>
+      <w:r>
+        <w:rPr>
+          <w:b/>
+          <w:bCs/>
+        </w:rPr>
+        <w:t xml:space="preserve">resolver.</w:t>
+      </w:r>
+      <w:r>
+        <w:t xml:space="preserve"> </w:t>
+      </w:r>
+      <w:r>
+        <w:rPr>
+          <w:i/>
+          <w:iCs/>
+        </w:rPr>
+        <w:t xml:space="preserve">Open — P0 inside PT2.</w:t>
+      </w:r>
+      <w:r>
+        <w:t xml:space="preserve"> </w:t>
+      </w:r>
+      <w:r>
+        <w:t xml:space="preserve">Read</w:t>
+      </w:r>
+      <w:r>
+        <w:t xml:space="preserve"> </w:t>
+      </w:r>
+      <w:r>
+        <w:rPr>
+          <w:rStyle w:val="VerbatimChar"/>
+        </w:rPr>
+        <w:t xml:space="preserve">alternateIds[XboxTitleId]</w:t>
+      </w:r>
+      <w:r>
+        <w:t xml:space="preserve"> </w:t>
+      </w:r>
+      <w:r>
+        <w:t xml:space="preserve">from XProduct; replaces today’s empty hardcode.</w:t>
+      </w:r>
+    </w:p>
+    <w:p>
+      <w:pPr>
+        <w:pStyle w:val="CompactParagraph"/>
+        <w:numPr>
+          <w:ilvl w:val="0"/>
+          <w:numId w:val="1003"/>
+        </w:numPr>
+      </w:pPr>
+      <w:r>
+        <w:rPr>
+          <w:rStyle w:val="VerbatimChar"/>
+          <w:b/>
+          <w:bCs/>
+        </w:rPr>
+        <w:t xml:space="preserve">AumID</w:t>
+      </w:r>
+      <w:r>
+        <w:rPr>
+          <w:b/>
+          <w:bCs/>
+        </w:rPr>
+        <w:t xml:space="preserve"> </w:t>
+      </w:r>
+      <w:r>
+        <w:rPr>
+          <w:b/>
+          <w:bCs/>
+        </w:rPr>
+        <w:t xml:space="preserve">for PC.</w:t>
+      </w:r>
+      <w:r>
+        <w:t xml:space="preserve"> </w:t>
+      </w:r>
+      <w:r>
+        <w:rPr>
+          <w:i/>
+          <w:iCs/>
+        </w:rPr>
+        <w:t xml:space="preserve">Decided.</w:t>
+      </w:r>
+      <w:r>
+        <w:t xml:space="preserve"> </w:t>
+      </w:r>
+      <w:r>
+        <w:t xml:space="preserve">Ship a constant default for v1 (telemetry-only on the server side); v1.1 plumbs the real</w:t>
+      </w:r>
+      <w:r>
+        <w:t xml:space="preserve"> </w:t>
+      </w:r>
+      <w:r>
+        <w:rPr>
+          <w:rStyle w:val="VerbatimChar"/>
+        </w:rPr>
+        <w:t xml:space="preserve">ApplicationId</w:t>
+      </w:r>
+      <w:r>
+        <w:t xml:space="preserve"> </w:t>
+      </w:r>
+      <w:r>
+        <w:t xml:space="preserve">from the AppX manifest.</w:t>
+      </w:r>
+    </w:p>
+    <w:p>
+      <w:pPr>
+        <w:pStyle w:val="CompactParagraph"/>
+        <w:numPr>
+          <w:ilvl w:val="0"/>
+          <w:numId w:val="1003"/>
+        </w:numPr>
+      </w:pPr>
+      <w:r>
+        <w:rPr>
+          <w:b/>
+          <w:bCs/>
+        </w:rPr>
+        <w:t xml:space="preserve">PC install poll path.</w:t>
+      </w:r>
+      <w:r>
+        <w:t xml:space="preserve"> </w:t>
+      </w:r>
+      <w:r>
+        <w:rPr>
+          <w:i/>
+          <w:iCs/>
+        </w:rPr>
+        <w:t xml:space="preserve">Open — audit lives in XC6.</w:t>
+      </w:r>
+      <w:r>
+        <w:t xml:space="preserve"> </w:t>
+      </w:r>
+      <w:r>
+        <w:t xml:space="preserve">Today’s allocator parameters are Xbox-only. XC6 audits the path and branches</w:t>
+      </w:r>
+      <w:r>
+        <w:t xml:space="preserve"> </w:t>
+      </w:r>
+      <w:r>
+        <w:rPr>
+          <w:rStyle w:val="VerbatimChar"/>
+        </w:rPr>
+        <w:t xml:space="preserve">ServerFilter</w:t>
+      </w:r>
+      <w:r>
+        <w:t xml:space="preserve"> </w:t>
+      </w:r>
+      <w:r>
+        <w:t xml:space="preserve">on</w:t>
+      </w:r>
+      <w:r>
+        <w:t xml:space="preserve"> </w:t>
+      </w:r>
+      <w:r>
+        <w:rPr>
+          <w:rStyle w:val="VerbatimChar"/>
+        </w:rPr>
+        <w:t xml:space="preserve">Platform</w:t>
+      </w:r>
+      <w:r>
+        <w:t xml:space="preserve">.</w:t>
+      </w:r>
+    </w:p>
+    <w:p>
+      <w:pPr>
+        <w:pStyle w:val="CompactParagraph"/>
+        <w:numPr>
+          <w:ilvl w:val="0"/>
+          <w:numId w:val="1003"/>
+        </w:numPr>
+      </w:pPr>
+      <w:r>
+        <w:rPr>
+          <w:b/>
+          <w:bCs/>
+        </w:rPr>
+        <w:t xml:space="preserve">Stable playtest identity for offering id.</w:t>
+      </w:r>
+      <w:r>
+        <w:t xml:space="preserve"> </w:t>
+      </w:r>
+      <w:r>
+        <w:rPr>
+          <w:i/>
+          <w:iCs/>
+        </w:rPr>
+        <w:t xml:space="preserve">Open.</w:t>
+      </w:r>
+      <w:r>
+        <w:t xml:space="preserve"> </w:t>
+      </w:r>
+      <w:r>
+        <w:t xml:space="preserve">xPlaytest confirms whether</w:t>
+      </w:r>
+      <w:r>
+        <w:t xml:space="preserve"> </w:t>
+      </w:r>
+      <w:r>
+        <w:rPr>
+          <w:rStyle w:val="VerbatimChar"/>
+        </w:rPr>
+        <w:t xml:space="preserve">PartnerCenterProductId</w:t>
+      </w:r>
+      <w:r>
+        <w:t xml:space="preserve"> </w:t>
+      </w:r>
+      <w:r>
+        <w:t xml:space="preserve">is stable across republishes (the recommended option); otherwise we use the equivalent stable upstream id. This is the one open item that materially changes the offering-proliferation story on nightly republishes.</w:t>
+      </w:r>
+    </w:p>
+    <w:p>
+      <w:pPr>
+        <w:pStyle w:val="CompactParagraph"/>
+        <w:numPr>
+          <w:ilvl w:val="0"/>
+          <w:numId w:val="1003"/>
+        </w:numPr>
+      </w:pPr>
+      <w:r>
+        <w:rPr>
+          <w:b/>
+          <w:bCs/>
+        </w:rPr>
+        <w:t xml:space="preserve">Delete model (tombstone vs. hard delete).</w:t>
+      </w:r>
+      <w:r>
+        <w:t xml:space="preserve"> </w:t>
+      </w:r>
+      <w:r>
+        <w:rPr>
+          <w:i/>
+          <w:iCs/>
+        </w:rPr>
+        <w:t xml:space="preserve">Decision pending sign-off.</w:t>
+      </w:r>
+      <w:r>
+        <w:t xml:space="preserve"> </w:t>
+      </w:r>
+      <w:r>
+        <w:t xml:space="preserve">v1 ships tombstone + 7-day GC. User-visible behavior matches the P0 wording, but the deviation needs explicit xCloud sign-off.</w:t>
+      </w:r>
+    </w:p>
+    <w:bookmarkEnd w:id="22"/>
+    <w:bookmarkStart w:id="23" w:name="glossary"/>
+    <w:p>
+      <w:pPr>
+        <w:pStyle w:val="Heading2"/>
+      </w:pPr>
+      <w:r>
+        <w:t xml:space="preserve">Glossary</w:t>
+      </w:r>
+    </w:p>
+    <w:p>
+      <w:pPr>
+        <w:pStyle w:val="CompactParagraph"/>
+        <w:numPr>
+          <w:ilvl w:val="0"/>
+          <w:numId w:val="1004"/>
+        </w:numPr>
+      </w:pPr>
+      <w:r>
+        <w:rPr>
+          <w:b/>
+          <w:bCs/>
+        </w:rPr>
+        <w:t xml:space="preserve">DNA group</w:t>
+      </w:r>
+      <w:r>
+        <w:t xml:space="preserve"> </w:t>
+      </w:r>
+      <w:r>
+        <w:t xml:space="preserve">— GMS audience grouping; resolves to the GUIDs in</w:t>
+      </w:r>
+      <w:r>
+        <w:t xml:space="preserve"> </w:t>
+      </w:r>
+      <w:r>
+        <w:rPr>
+          <w:rStyle w:val="VerbatimChar"/>
+        </w:rPr>
+        <w:t xml:space="preserve">AllowedDnaGroups</w:t>
+      </w:r>
+      <w:r>
+        <w:t xml:space="preserve">.</w:t>
+      </w:r>
+    </w:p>
+    <w:p>
+      <w:pPr>
+        <w:pStyle w:val="CompactParagraph"/>
+        <w:numPr>
+          <w:ilvl w:val="0"/>
+          <w:numId w:val="1004"/>
+        </w:numPr>
+      </w:pPr>
+      <w:r>
+        <w:rPr>
+          <w:b/>
+          <w:bCs/>
+        </w:rPr>
+        <w:t xml:space="preserve">GMS</w:t>
+      </w:r>
+      <w:r>
+        <w:t xml:space="preserve"> </w:t>
+      </w:r>
+      <w:r>
+        <w:t xml:space="preserve">— Group Management Service.</w:t>
+      </w:r>
+    </w:p>
+    <w:p>
+      <w:pPr>
+        <w:pStyle w:val="CompactParagraph"/>
+        <w:numPr>
+          <w:ilvl w:val="0"/>
+          <w:numId w:val="1004"/>
+        </w:numPr>
+      </w:pPr>
+      <w:r>
+        <w:rPr>
+          <w:b/>
+          <w:bCs/>
+        </w:rPr>
+        <w:t xml:space="preserve">GsToken</w:t>
+      </w:r>
+      <w:r>
+        <w:t xml:space="preserve"> </w:t>
+      </w:r>
+      <w:r>
+        <w:t xml:space="preserve">— Game Streaming token; carries</w:t>
+      </w:r>
+      <w:r>
+        <w:t xml:space="preserve"> </w:t>
+      </w:r>
+      <w:r>
+        <w:rPr>
+          <w:rStyle w:val="VerbatimChar"/>
+        </w:rPr>
+        <w:t xml:space="preserve">DnaGroups</w:t>
+      </w:r>
+      <w:r>
+        <w:t xml:space="preserve"> </w:t>
+      </w:r>
+      <w:r>
+        <w:t xml:space="preserve">claims.</w:t>
+      </w:r>
+    </w:p>
+    <w:p>
+      <w:pPr>
+        <w:pStyle w:val="CompactParagraph"/>
+        <w:numPr>
+          <w:ilvl w:val="0"/>
+          <w:numId w:val="1004"/>
+        </w:numPr>
+      </w:pPr>
+      <w:r>
+        <w:rPr>
+          <w:b/>
+          <w:bCs/>
+        </w:rPr>
+        <w:t xml:space="preserve">SAGE</w:t>
+      </w:r>
+      <w:r>
+        <w:t xml:space="preserve"> </w:t>
+      </w:r>
+      <w:r>
+        <w:t xml:space="preserve">— Service API Gateway; cross-tenant ingress proxy for xCloud.</w:t>
+      </w:r>
+    </w:p>
+    <w:p>
+      <w:pPr>
+        <w:pStyle w:val="CompactParagraph"/>
+        <w:numPr>
+          <w:ilvl w:val="0"/>
+          <w:numId w:val="1004"/>
+        </w:numPr>
+      </w:pPr>
+      <w:r>
+        <w:rPr>
+          <w:b/>
+          <w:bCs/>
+        </w:rPr>
+        <w:t xml:space="preserve">SUCU</w:t>
+      </w:r>
+      <w:r>
+        <w:t xml:space="preserve"> </w:t>
+      </w:r>
+      <w:r>
+        <w:t xml:space="preserve">— Streaming Update Catalog; xCloud’s package-version resolution.</w:t>
+      </w:r>
+    </w:p>
+    <w:p>
+      <w:pPr>
+        <w:pStyle w:val="CompactParagraph"/>
+        <w:numPr>
+          <w:ilvl w:val="0"/>
+          <w:numId w:val="1004"/>
+        </w:numPr>
+      </w:pPr>
+      <w:r>
+        <w:rPr>
+          <w:b/>
+          <w:bCs/>
+        </w:rPr>
+        <w:t xml:space="preserve">SFI</w:t>
+      </w:r>
+      <w:r>
+        <w:t xml:space="preserve"> </w:t>
+      </w:r>
+      <w:r>
+        <w:t xml:space="preserve">— Secure Future Initiative; the policy regime that forbids self-approving PRs.</w:t>
+      </w:r>
+    </w:p>
+    <w:p>
+      <w:pPr>
+        <w:pStyle w:val="CompactParagraph"/>
+        <w:numPr>
+          <w:ilvl w:val="0"/>
+          <w:numId w:val="1004"/>
         </w:numPr>
       </w:pPr>
       <w:r>
@@ -4052,6 +3621,109 @@
       </w:pPr>
     </w:lvl>
   </w:abstractNum>
+  <w:abstractNum w:abstractNumId="991">
+    <w:nsid w:val="0000A991"/>
+    <w:multiLevelType w:val="multilevel"/>
+    <w:lvl w:ilvl="0">
+      <w:numFmt w:val="bullet"/>
+      <w:lvlText w:val=""/>
+      <w:lvlJc w:val="left"/>
+      <w:pPr>
+        <w:ind w:left="720" w:hanging="360"/>
+      </w:pPr>
+      <w:rPr>
+        <w:rFonts w:ascii="Symbol" w:hAnsi="Symbol" w:cs="Symbol" w:hint="default"/>
+      </w:rPr>
+    </w:lvl>
+    <w:lvl w:ilvl="1">
+      <w:numFmt w:val="bullet"/>
+      <w:lvlText w:val="o"/>
+      <w:lvlJc w:val="left"/>
+      <w:pPr>
+        <w:ind w:left="1440" w:hanging="360"/>
+      </w:pPr>
+      <w:rPr>
+        <w:rFonts w:ascii="Courier New" w:hAnsi="Courier New" w:cs="Courier New" w:hint="default"/>
+      </w:rPr>
+    </w:lvl>
+    <w:lvl w:ilvl="2">
+      <w:numFmt w:val="bullet"/>
+      <w:lvlText w:val=""/>
+      <w:lvlJc w:val="left"/>
+      <w:pPr>
+        <w:ind w:left="2160" w:hanging="360"/>
+      </w:pPr>
+      <w:rPr>
+        <w:rFonts w:ascii="Wingdings" w:hAnsi="Wingdings" w:cs="Wingdings" w:hint="default"/>
+      </w:rPr>
+    </w:lvl>
+    <w:lvl w:ilvl="3">
+      <w:numFmt w:val="bullet"/>
+      <w:lvlText w:val=""/>
+      <w:lvlJc w:val="left"/>
+      <w:pPr>
+        <w:ind w:left="2880" w:hanging="360"/>
+      </w:pPr>
+      <w:rPr>
+        <w:rFonts w:ascii="Symbol" w:hAnsi="Symbol" w:cs="Symbol" w:hint="default"/>
+      </w:rPr>
+    </w:lvl>
+    <w:lvl w:ilvl="4">
+      <w:numFmt w:val="bullet"/>
+      <w:lvlText w:val="o"/>
+      <w:lvlJc w:val="left"/>
+      <w:pPr>
+        <w:ind w:left="3600" w:hanging="360"/>
+      </w:pPr>
+      <w:rPr>
+        <w:rFonts w:ascii="Courier New" w:hAnsi="Courier New" w:cs="Courier New" w:hint="default"/>
+      </w:rPr>
+    </w:lvl>
+    <w:lvl w:ilvl="5">
+      <w:numFmt w:val="bullet"/>
+      <w:lvlText w:val=""/>
+      <w:lvlJc w:val="left"/>
+      <w:pPr>
+        <w:ind w:left="4320" w:hanging="360"/>
+      </w:pPr>
+      <w:rPr>
+        <w:rFonts w:ascii="Wingdings" w:hAnsi="Wingdings" w:cs="Wingdings" w:hint="default"/>
+      </w:rPr>
+    </w:lvl>
+    <w:lvl w:ilvl="6">
+      <w:numFmt w:val="bullet"/>
+      <w:lvlText w:val=""/>
+      <w:lvlJc w:val="left"/>
+      <w:pPr>
+        <w:ind w:left="5040" w:hanging="360"/>
+      </w:pPr>
+      <w:rPr>
+        <w:rFonts w:ascii="Symbol" w:hAnsi="Symbol" w:cs="Symbol" w:hint="default"/>
+      </w:rPr>
+    </w:lvl>
+    <w:lvl w:ilvl="7">
+      <w:numFmt w:val="bullet"/>
+      <w:lvlText w:val="o"/>
+      <w:lvlJc w:val="left"/>
+      <w:pPr>
+        <w:ind w:left="5760" w:hanging="360"/>
+      </w:pPr>
+      <w:rPr>
+        <w:rFonts w:ascii="Courier New" w:hAnsi="Courier New" w:cs="Courier New" w:hint="default"/>
+      </w:rPr>
+    </w:lvl>
+    <w:lvl w:ilvl="8">
+      <w:numFmt w:val="bullet"/>
+      <w:lvlText w:val=""/>
+      <w:lvlJc w:val="left"/>
+      <w:pPr>
+        <w:ind w:left="6480" w:hanging="360"/>
+      </w:pPr>
+      <w:rPr>
+        <w:rFonts w:ascii="Wingdings" w:hAnsi="Wingdings" w:cs="Wingdings" w:hint="default"/>
+      </w:rPr>
+    </w:lvl>
+  </w:abstractNum>
   <w:abstractNum w:abstractNumId="99411">
     <w:nsid w:val="00A99411"/>
     <w:multiLevelType w:val="multilevel"/>
@@ -4137,113 +3809,13 @@
       </w:pPr>
     </w:lvl>
   </w:abstractNum>
-  <w:abstractNum w:abstractNumId="991">
-    <w:nsid w:val="0000A991"/>
-    <w:multiLevelType w:val="multilevel"/>
-    <w:lvl w:ilvl="0">
-      <w:numFmt w:val="bullet"/>
-      <w:lvlText w:val=""/>
-      <w:lvlJc w:val="left"/>
-      <w:pPr>
-        <w:ind w:left="720" w:hanging="360"/>
-      </w:pPr>
-      <w:rPr>
-        <w:rFonts w:ascii="Symbol" w:hAnsi="Symbol" w:cs="Symbol" w:hint="default"/>
-      </w:rPr>
-    </w:lvl>
-    <w:lvl w:ilvl="1">
-      <w:numFmt w:val="bullet"/>
-      <w:lvlText w:val="o"/>
-      <w:lvlJc w:val="left"/>
-      <w:pPr>
-        <w:ind w:left="1440" w:hanging="360"/>
-      </w:pPr>
-      <w:rPr>
-        <w:rFonts w:ascii="Courier New" w:hAnsi="Courier New" w:cs="Courier New" w:hint="default"/>
-      </w:rPr>
-    </w:lvl>
-    <w:lvl w:ilvl="2">
-      <w:numFmt w:val="bullet"/>
-      <w:lvlText w:val=""/>
-      <w:lvlJc w:val="left"/>
-      <w:pPr>
-        <w:ind w:left="2160" w:hanging="360"/>
-      </w:pPr>
-      <w:rPr>
-        <w:rFonts w:ascii="Wingdings" w:hAnsi="Wingdings" w:cs="Wingdings" w:hint="default"/>
-      </w:rPr>
-    </w:lvl>
-    <w:lvl w:ilvl="3">
-      <w:numFmt w:val="bullet"/>
-      <w:lvlText w:val=""/>
-      <w:lvlJc w:val="left"/>
-      <w:pPr>
-        <w:ind w:left="2880" w:hanging="360"/>
-      </w:pPr>
-      <w:rPr>
-        <w:rFonts w:ascii="Symbol" w:hAnsi="Symbol" w:cs="Symbol" w:hint="default"/>
-      </w:rPr>
-    </w:lvl>
-    <w:lvl w:ilvl="4">
-      <w:numFmt w:val="bullet"/>
-      <w:lvlText w:val="o"/>
-      <w:lvlJc w:val="left"/>
-      <w:pPr>
-        <w:ind w:left="3600" w:hanging="360"/>
-      </w:pPr>
-      <w:rPr>
-        <w:rFonts w:ascii="Courier New" w:hAnsi="Courier New" w:cs="Courier New" w:hint="default"/>
-      </w:rPr>
-    </w:lvl>
-    <w:lvl w:ilvl="5">
-      <w:numFmt w:val="bullet"/>
-      <w:lvlText w:val=""/>
-      <w:lvlJc w:val="left"/>
-      <w:pPr>
-        <w:ind w:left="4320" w:hanging="360"/>
-      </w:pPr>
-      <w:rPr>
-        <w:rFonts w:ascii="Wingdings" w:hAnsi="Wingdings" w:cs="Wingdings" w:hint="default"/>
-      </w:rPr>
-    </w:lvl>
-    <w:lvl w:ilvl="6">
-      <w:numFmt w:val="bullet"/>
-      <w:lvlText w:val=""/>
-      <w:lvlJc w:val="left"/>
-      <w:pPr>
-        <w:ind w:left="5040" w:hanging="360"/>
-      </w:pPr>
-      <w:rPr>
-        <w:rFonts w:ascii="Symbol" w:hAnsi="Symbol" w:cs="Symbol" w:hint="default"/>
-      </w:rPr>
-    </w:lvl>
-    <w:lvl w:ilvl="7">
-      <w:numFmt w:val="bullet"/>
-      <w:lvlText w:val="o"/>
-      <w:lvlJc w:val="left"/>
-      <w:pPr>
-        <w:ind w:left="5760" w:hanging="360"/>
-      </w:pPr>
-      <w:rPr>
-        <w:rFonts w:ascii="Courier New" w:hAnsi="Courier New" w:cs="Courier New" w:hint="default"/>
-      </w:rPr>
-    </w:lvl>
-    <w:lvl w:ilvl="8">
-      <w:numFmt w:val="bullet"/>
-      <w:lvlText w:val=""/>
-      <w:lvlJc w:val="left"/>
-      <w:pPr>
-        <w:ind w:left="6480" w:hanging="360"/>
-      </w:pPr>
-      <w:rPr>
-        <w:rFonts w:ascii="Wingdings" w:hAnsi="Wingdings" w:cs="Wingdings" w:hint="default"/>
-      </w:rPr>
-    </w:lvl>
-  </w:abstractNum>
   <w:num w:numId="1000">
     <w:abstractNumId w:val="990"/>
   </w:num>
   <w:num w:numId="1001">
+    <w:abstractNumId w:val="991"/>
+  </w:num>
+  <w:num w:numId="1002">
     <w:abstractNumId w:val="99411"/>
     <w:lvlOverride w:ilvl="0">
       <w:startOverride w:val="1"/>
@@ -4273,7 +3845,10 @@
       <w:startOverride w:val="1"/>
     </w:lvlOverride>
   </w:num>
-  <w:num w:numId="1002">
+  <w:num w:numId="1003">
+    <w:abstractNumId w:val="991"/>
+  </w:num>
+  <w:num w:numId="1004">
     <w:abstractNumId w:val="991"/>
   </w:num>
 </w:numbering>
@@ -4314,7 +3889,6 @@
       <w:rFonts w:ascii="Segoe UI Light" w:hAnsi="Segoe UI Light"/>
       <w:color w:val="0F6CBD"/>
       <w:sz w:val="64"/>
-      <w:szCs w:val="64"/>
     </w:rPr>
   </w:style>
   <w:style w:styleId="Subtitle" w:type="paragraph">
@@ -4333,7 +3907,6 @@
       <w:rFonts w:ascii="Segoe UI" w:hAnsi="Segoe UI"/>
       <w:color w:val="595959"/>
       <w:sz w:val="28"/>
-      <w:szCs w:val="28"/>
       <w:i/>
     </w:rPr>
   </w:style>
@@ -4350,7 +3923,6 @@
       <w:rFonts w:ascii="Segoe UI Semibold" w:hAnsi="Segoe UI Semibold"/>
       <w:color w:val="404040"/>
       <w:sz w:val="24"/>
-      <w:szCs w:val="24"/>
     </w:rPr>
   </w:style>
   <w:style w:styleId="Date" w:type="paragraph">
@@ -4366,7 +3938,6 @@
       <w:rFonts w:ascii="Segoe UI" w:hAnsi="Segoe UI"/>
       <w:color w:val="808080"/>
       <w:sz w:val="20"/>
-      <w:szCs w:val="20"/>
     </w:rPr>
   </w:style>
   <w:style w:styleId="BodyText" w:type="paragraph">
@@ -4400,7 +3971,6 @@
       <w:rFonts w:ascii="Segoe UI Semibold" w:hAnsi="Segoe UI Semibold"/>
       <w:color w:val="0F6CBD"/>
       <w:sz w:val="36"/>
-      <w:szCs w:val="36"/>
     </w:rPr>
   </w:style>
   <w:style w:styleId="Heading2" w:type="paragraph">
@@ -4418,7 +3988,6 @@
       <w:rFonts w:ascii="Segoe UI Semibold" w:hAnsi="Segoe UI Semibold"/>
       <w:color w:val="2B579A"/>
       <w:sz w:val="28"/>
-      <w:szCs w:val="28"/>
     </w:rPr>
   </w:style>
   <w:style w:styleId="Heading3" w:type="paragraph">
@@ -4436,7 +4005,6 @@
       <w:rFonts w:ascii="Segoe UI Semibold" w:hAnsi="Segoe UI Semibold"/>
       <w:color w:val="2B579A"/>
       <w:sz w:val="24"/>
-      <w:szCs w:val="24"/>
     </w:rPr>
   </w:style>
   <w:style w:styleId="Heading4" w:type="paragraph">
@@ -4454,7 +4022,6 @@
       <w:rFonts w:ascii="Segoe UI Semibold" w:hAnsi="Segoe UI Semibold"/>
       <w:color w:val="404040"/>
       <w:sz w:val="22"/>
-      <w:szCs w:val="22"/>
     </w:rPr>
   </w:style>
   <w:style w:styleId="Heading5" w:type="paragraph">
@@ -4472,7 +4039,6 @@
       <w:rFonts w:ascii="Segoe UI Semibold" w:hAnsi="Segoe UI Semibold"/>
       <w:color w:val="404040"/>
       <w:sz w:val="20"/>
-      <w:szCs w:val="20"/>
     </w:rPr>
   </w:style>
   <w:style w:styleId="Heading6" w:type="paragraph">
@@ -4491,7 +4057,6 @@
       <w:i/>
       <w:color w:val="595959"/>
       <w:sz w:val="20"/>
-      <w:szCs w:val="20"/>
     </w:rPr>
   </w:style>
   <w:style w:styleId="BlockText" w:type="paragraph">
@@ -4523,7 +4088,6 @@
     <w:rPr>
       <w:rFonts w:ascii="Cascadia Mono" w:cs="Cascadia Mono" w:hAnsi="Cascadia Mono"/>
       <w:sz w:val="18"/>
-      <w:szCs w:val="18"/>
     </w:rPr>
   </w:style>
   <w:style w:styleId="VerbatimChar" w:type="character">
@@ -4532,7 +4096,6 @@
     <w:rPr>
       <w:rFonts w:ascii="Cascadia Mono" w:cs="Cascadia Mono" w:hAnsi="Cascadia Mono"/>
       <w:sz w:val="18"/>
-      <w:szCs w:val="18"/>
       <w:shd w:color="auto" w:fill="F5F5F5" w:val="clear"/>
     </w:rPr>
   </w:style>
@@ -4649,7 +4212,6 @@
     </w:tblPr>
     <w:rPr>
       <w:sz w:val="20"/>
-      <w:szCs w:val="20"/>
     </w:rPr>
     <w:tblStylePr w:type="firstRow">
       <w:rPr>

</xml_diff>